<commit_message>
feat: implement bulk certificate generation endpoint with Word template processing and PDF conversion support
</commit_message>
<xml_diff>
--- a/app/modules/bahia_sem_fome/assets/atestes.docx
+++ b/app/modules/bahia_sem_fome/assets/atestes.docx
@@ -1,6 +1,72 @@
 
-<file path=word/document.xml><?xml version="1.0" encoding="utf-8"?>
-<w:document xmlns:wpc="http://schemas.microsoft.com/office/word/2010/wordprocessingCanvas" xmlns:cx="http://schemas.microsoft.com/office/drawing/2014/chartex" xmlns:cx1="http://schemas.microsoft.com/office/drawing/2015/9/8/chartex" xmlns:cx2="http://schemas.microsoft.com/office/drawing/2015/10/21/chartex" xmlns:cx3="http://schemas.microsoft.com/office/drawing/2016/5/9/chartex" xmlns:cx4="http://schemas.microsoft.com/office/drawing/2016/5/10/chartex" xmlns:cx5="http://schemas.microsoft.com/office/drawing/2016/5/11/chartex" xmlns:cx6="http://schemas.microsoft.com/office/drawing/2016/5/12/chartex" xmlns:cx7="http://schemas.microsoft.com/office/drawing/2016/5/13/chartex" xmlns:cx8="http://schemas.microsoft.com/office/drawing/2016/5/14/chartex" xmlns:mc="http://schemas.openxmlformats.org/markup-compatibility/2006" xmlns:aink="http://schemas.microsoft.com/office/drawing/2016/ink" xmlns:am3d="http://schemas.microsoft.com/office/drawing/2017/model3d" xmlns:o="urn:schemas-microsoft-com:office:office" xmlns:oel="http://schemas.microsoft.com/office/2019/extlst" xmlns:r="http://schemas.openxmlformats.org/officeDocument/2006/relationships" xmlns:m="http://schemas.openxmlformats.org/officeDocument/2006/math" xmlns:v="urn:schemas-microsoft-com:vml" xmlns:wp14="http://schemas.microsoft.com/office/word/2010/wordprocessingDrawing" xmlns:wp="http://schemas.openxmlformats.org/drawingml/2006/wordprocessingDrawing" xmlns:w10="urn:schemas-microsoft-com:office:word" xmlns:w="http://schemas.openxmlformats.org/wordprocessingml/2006/main" xmlns:w14="http://schemas.microsoft.com/office/word/2010/wordml" xmlns:w15="http://schemas.microsoft.com/office/word/2012/wordml" xmlns:w16cex="http://schemas.microsoft.com/office/word/2018/wordml/cex" xmlns:w16cid="http://schemas.microsoft.com/office/word/2016/wordml/cid" xmlns:w16="http://schemas.microsoft.com/office/word/2018/wordml" xmlns:w16du="http://schemas.microsoft.com/office/word/2023/wordml/word16du" xmlns:w16sdtdh="http://schemas.microsoft.com/office/word/2020/wordml/sdtdatahash" xmlns:w16sdtfl="http://schemas.microsoft.com/office/word/2024/wordml/sdtformatlock" xmlns:w16se="http://schemas.microsoft.com/office/word/2015/wordml/symex" xmlns:wpg="http://schemas.microsoft.com/office/word/2010/wordprocessingGroup" xmlns:wpi="http://schemas.microsoft.com/office/word/2010/wordprocessingInk" xmlns:wne="http://schemas.microsoft.com/office/word/2006/wordml" xmlns:wps="http://schemas.microsoft.com/office/word/2010/wordprocessingShape" mc:Ignorable="w14 w15 w16se w16cid w16 w16cex w16sdtdh w16sdtfl w16du wp14">
+<file path=docProps\app.xml><?xml version="1.0" encoding="utf-8"?>
+<Properties xmlns="http://schemas.openxmlformats.org/officeDocument/2006/extended-properties" xmlns:vt="http://schemas.openxmlformats.org/officeDocument/2006/docPropsVTypes">
+  <Template>Normal</Template>
+  <TotalTime>3</TotalTime>
+  <Pages>1</Pages>
+  <Words>262</Words>
+  <Characters>1421</Characters>
+  <Application>Microsoft Office Word</Application>
+  <DocSecurity>0</DocSecurity>
+  <Lines>11</Lines>
+  <Paragraphs>3</Paragraphs>
+  <ScaleCrop>false</ScaleCrop>
+  <HeadingPairs>
+    <vt:vector size="2" baseType="variant">
+      <vt:variant>
+        <vt:lpstr>Título</vt:lpstr>
+      </vt:variant>
+      <vt:variant>
+        <vt:i4>1</vt:i4>
+      </vt:variant>
+    </vt:vector>
+  </HeadingPairs>
+  <TitlesOfParts>
+    <vt:vector size="1" baseType="lpstr">
+      <vt:lpstr/>
+    </vt:vector>
+  </TitlesOfParts>
+  <Company/>
+  <LinksUpToDate>false</LinksUpToDate>
+  <CharactersWithSpaces>1680</CharactersWithSpaces>
+  <SharedDoc>false</SharedDoc>
+  <HyperlinksChanged>false</HyperlinksChanged>
+  <AppVersion>16.0000</AppVersion>
+</Properties>
+</file>
+
+<file path=docProps\core.xml><?xml version="1.0" encoding="utf-8"?>
+<cp:coreProperties xmlns:cp="http://schemas.openxmlformats.org/package/2006/metadata/core-properties" xmlns:dc="http://purl.org/dc/elements/1.1/" xmlns:dcterms="http://purl.org/dc/terms/" xmlns:dcmitype="http://purl.org/dc/dcmitype/" xmlns:xsi="http://www.w3.org/2001/XMLSchema-instance">
+  <dc:creator>ovidio</dc:creator>
+  <cp:lastModifiedBy>CLIENTE</cp:lastModifiedBy>
+  <cp:revision>6</cp:revision>
+  <dcterms:created xsi:type="dcterms:W3CDTF">2026-07-03T13:55:00Z</dcterms:created>
+  <dcterms:modified xsi:type="dcterms:W3CDTF">2026-07-09T18:27:00Z</dcterms:modified>
+</cp:coreProperties>
+</file>
+
+<file path=docProps\custom.xml><?xml version="1.0" encoding="utf-8"?>
+<Properties xmlns="http://schemas.openxmlformats.org/officeDocument/2006/custom-properties" xmlns:vt="http://schemas.openxmlformats.org/officeDocument/2006/docPropsVTypes">
+  <property fmtid="{D5CDD505-2E9C-101B-9397-08002B2CF9AE}" pid="2" name="Converter">
+    <vt:lpwstr>SolidFramework v10.0.19910.1</vt:lpwstr>
+  </property>
+  <property fmtid="{D5CDD505-2E9C-101B-9397-08002B2CF9AE}" pid="3" name="Created">
+    <vt:filetime>2025-10-10T00:00:00Z</vt:filetime>
+  </property>
+  <property fmtid="{D5CDD505-2E9C-101B-9397-08002B2CF9AE}" pid="4" name="Creator">
+    <vt:lpwstr>Microsoft® Word 2016</vt:lpwstr>
+  </property>
+  <property fmtid="{D5CDD505-2E9C-101B-9397-08002B2CF9AE}" pid="5" name="LastSaved">
+    <vt:filetime>2026-07-03T00:00:00Z</vt:filetime>
+  </property>
+  <property fmtid="{D5CDD505-2E9C-101B-9397-08002B2CF9AE}" pid="6" name="Producer">
+    <vt:lpwstr>www.ilovepdf.com</vt:lpwstr>
+  </property>
+</Properties>
+</file>
+
+<file path=word\document.xml><?xml version="1.0" encoding="utf-8"?>
+<w:document xmlns:wpc="http://schemas.microsoft.com/office/word/2010/wordprocessingCanvas" xmlns:cx="http://schemas.microsoft.com/office/drawing/2014/chartex" xmlns:cx1="http://schemas.microsoft.com/office/drawing/2015/9/8/chartex" xmlns:cx2="http://schemas.microsoft.com/office/drawing/2015/10/21/chartex" xmlns:cx3="http://schemas.microsoft.com/office/drawing/2016/5/9/chartex" xmlns:cx4="http://schemas.microsoft.com/office/drawing/2016/5/10/chartex" xmlns:cx5="http://schemas.microsoft.com/office/drawing/2016/5/11/chartex" xmlns:cx6="http://schemas.microsoft.com/office/drawing/2016/5/12/chartex" xmlns:cx7="http://schemas.microsoft.com/office/drawing/2016/5/13/chartex" xmlns:cx8="http://schemas.microsoft.com/office/drawing/2016/5/14/chartex" xmlns:mc="http://schemas.openxmlformats.org/markup-compatibility/2006" xmlns:aink="http://schemas.microsoft.com/office/drawing/2016/ink" xmlns:am3d="http://schemas.microsoft.com/office/drawing/2017/model3d" xmlns:o="urn:schemas-microsoft-com:office:office" xmlns:r="http://schemas.openxmlformats.org/officeDocument/2006/relationships" xmlns:m="http://schemas.openxmlformats.org/officeDocument/2006/math" xmlns:v="urn:schemas-microsoft-com:vml" xmlns:wp14="http://schemas.microsoft.com/office/word/2010/wordprocessingDrawing" xmlns:wp="http://schemas.openxmlformats.org/drawingml/2006/wordprocessingDrawing" xmlns:w10="urn:schemas-microsoft-com:office:word" xmlns:w="http://schemas.openxmlformats.org/wordprocessingml/2006/main" xmlns:w14="http://schemas.microsoft.com/office/word/2010/wordml" xmlns:w15="http://schemas.microsoft.com/office/word/2012/wordml" xmlns:w16cex="http://schemas.microsoft.com/office/word/2018/wordml/cex" xmlns:w16cid="http://schemas.microsoft.com/office/word/2016/wordml/cid" xmlns:w16="http://schemas.microsoft.com/office/word/2018/wordml" xmlns:w16sdtdh="http://schemas.microsoft.com/office/word/2020/wordml/sdtdatahash" xmlns:w16se="http://schemas.microsoft.com/office/word/2015/wordml/symex" xmlns:wpg="http://schemas.microsoft.com/office/word/2010/wordprocessingGroup" xmlns:wpi="http://schemas.microsoft.com/office/word/2010/wordprocessingInk" xmlns:wne="http://schemas.microsoft.com/office/word/2006/wordml" xmlns:wps="http://schemas.microsoft.com/office/word/2010/wordprocessingShape" mc:Ignorable="w14 w15 w16se w16cid w16 w16cex w16sdtdh wp14">
   <w:body>
     <w:p>
       <w:pPr>
@@ -405,12 +471,11 @@
           </mc:Choice>
           <mc:Fallback>
             <w:pict>
-              <v:shapetype id="_x0000_t202" coordsize="21600,21600" o:spt="202" path="m,l,21600r21600,l21600,xe">
+              <v:shapetype w14:anchorId="4A7C2EAC" id="_x0000_t202" coordsize="21600,21600" o:spt="202" path="m,l,21600r21600,l21600,xe">
                 <v:stroke joinstyle="miter"/>
                 <v:path gradientshapeok="t" o:connecttype="rect"/>
               </v:shapetype>
-              <v:shape id="Textbox 5" o:spid="_x0000_s1026" type="#_x0000_t202" style="position:absolute;margin-left:20.4pt;margin-top:19.35pt;width:548.2pt;height:25.25pt;z-index:-15728640;visibility:visible;mso-wrap-style:square;mso-wrap-distance-left:0;mso-wrap-distance-top:0;mso-wrap-distance-right:0;mso-wrap-distance-bottom:0;mso-position-horizontal:absolute;mso-position-horizontal-relative:page;mso-position-vertical:absolute;mso-position-vertical-relative:text;v-text-anchor:top" o:gfxdata="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" fillcolor="#dbe4f0" stroked="f">
-                <v:path arrowok="t"/>
+              <v:shape id="Textbox 5" o:spid="_x0000_s1026" type="#_x0000_t202" style="position:absolute;margin-left:20.4pt;margin-top:19.35pt;width:548.2pt;height:25.25pt;z-index:-15728640;visibility:visible;mso-wrap-style:square;mso-wrap-distance-left:0;mso-wrap-distance-top:0;mso-wrap-distance-right:0;mso-wrap-distance-bottom:0;mso-position-horizontal:absolute;mso-position-horizontal-relative:page;mso-position-vertical:absolute;mso-position-vertical-relative:text;v-text-anchor:top" o:gfxdata="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" fillcolor="#dbe4f0" stroked="f">
                 <v:textbox inset="0,0,0,0">
                   <w:txbxContent>
                     <w:p>
@@ -1102,14 +1167,7 @@
                 <w:rFonts w:ascii="Arial" w:hAnsi="Arial" w:cs="Arial"/>
                 <w:color w:val="000000" w:themeColor="text1"/>
               </w:rPr>
-              <w:t xml:space="preserve"> </w:t>
-            </w:r>
-            <w:r>
-              <w:rPr>
-                <w:rFonts w:ascii="Arial" w:hAnsi="Arial" w:cs="Arial"/>
-                <w:color w:val="000000" w:themeColor="text1"/>
-              </w:rPr>
-              <w:t>{{</w:t>
+              <w:t xml:space="preserve"> {{</w:t>
             </w:r>
             <w:r>
               <w:rPr>
@@ -1282,7 +1340,16 @@
                 <w:sz w:val="20"/>
                 <w:szCs w:val="20"/>
               </w:rPr>
-              <w:t>{cpf_beneficiario}}</w:t>
+              <w:t>{</w:t>
+            </w:r>
+            <w:r>
+              <w:rPr>
+                <w:rFonts w:ascii="Arial" w:hAnsi="Arial" w:cs="Arial"/>
+                <w:b/>
+                <w:sz w:val="20"/>
+                <w:szCs w:val="20"/>
+              </w:rPr>
+              <w:t>{{cpf_beneficiario}}</w:t>
             </w:r>
           </w:p>
         </w:tc>
@@ -2792,7 +2859,7 @@
               </wp:anchor>
             </w:drawing>
           </mc:Choice>
-          <mc:Fallback>
+          <mc:Fallback xmlns:w16sdtfl="http://schemas.microsoft.com/office/word/2024/wordml/sdtformatlock" xmlns:w16du="http://schemas.microsoft.com/office/word/2023/wordml/word16du" xmlns:oel="http://schemas.microsoft.com/office/2019/extlst">
             <w:pict>
               <v:shape w14:anchorId="56F419D0" id="Graphic 6" o:spid="_x0000_s1026" style="position:absolute;margin-left:35.75pt;margin-top:20.7pt;width:236.85pt;height:1.45pt;z-index:-15728128;visibility:visible;mso-wrap-style:square;mso-wrap-distance-left:0;mso-wrap-distance-top:0;mso-wrap-distance-right:0;mso-wrap-distance-bottom:0;mso-position-horizontal:absolute;mso-position-horizontal-relative:page;mso-position-vertical:absolute;mso-position-vertical-relative:text;v-text-anchor:top" coordsize="3007995,18415" o:gfxdata="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" path="m3007487,l,,,18287r3007487,l3007487,xe" fillcolor="black" stroked="f">
                 <v:path arrowok="t"/>
@@ -2882,7 +2949,7 @@
               </wp:anchor>
             </w:drawing>
           </mc:Choice>
-          <mc:Fallback>
+          <mc:Fallback xmlns:w16sdtfl="http://schemas.microsoft.com/office/word/2024/wordml/sdtformatlock" xmlns:w16du="http://schemas.microsoft.com/office/word/2023/wordml/word16du" xmlns:oel="http://schemas.microsoft.com/office/2019/extlst">
             <w:pict>
               <v:shape w14:anchorId="02307D5E" id="Graphic 7" o:spid="_x0000_s1026" style="position:absolute;margin-left:309.55pt;margin-top:21.45pt;width:249.55pt;height:1.45pt;z-index:-15727616;visibility:visible;mso-wrap-style:square;mso-wrap-distance-left:0;mso-wrap-distance-top:0;mso-wrap-distance-right:0;mso-wrap-distance-bottom:0;mso-position-horizontal:absolute;mso-position-horizontal-relative:page;mso-position-vertical:absolute;mso-position-vertical-relative:text;v-text-anchor:top" coordsize="3169285,18415" o:gfxdata="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" path="m3169030,l,,,18287r3169030,l3169030,xe" fillcolor="black" stroked="f">
                 <v:path arrowok="t"/>
@@ -3053,7 +3120,7 @@
               </wp:anchor>
             </w:drawing>
           </mc:Choice>
-          <mc:Fallback>
+          <mc:Fallback xmlns:w16sdtfl="http://schemas.microsoft.com/office/word/2024/wordml/sdtformatlock" xmlns:w16du="http://schemas.microsoft.com/office/word/2023/wordml/word16du" xmlns:oel="http://schemas.microsoft.com/office/2019/extlst">
             <w:pict>
               <v:shape w14:anchorId="75B15D67" id="Graphic 8" o:spid="_x0000_s1026" style="position:absolute;margin-left:177.5pt;margin-top:12.55pt;width:373.3pt;height:1.45pt;z-index:-15727104;visibility:visible;mso-wrap-style:square;mso-wrap-distance-left:0;mso-wrap-distance-top:0;mso-wrap-distance-right:0;mso-wrap-distance-bottom:0;mso-position-horizontal:absolute;mso-position-horizontal-relative:page;mso-position-vertical:absolute;mso-position-vertical-relative:text;v-text-anchor:top" coordsize="4740910,18415" o:gfxdata="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" path="m4740529,l,,,18287r4740529,l4740529,xe" fillcolor="black" stroked="f">
                 <v:path arrowok="t"/>
@@ -3146,7 +3213,7 @@
               </wp:anchor>
             </w:drawing>
           </mc:Choice>
-          <mc:Fallback>
+          <mc:Fallback xmlns:w16sdtfl="http://schemas.microsoft.com/office/word/2024/wordml/sdtformatlock" xmlns:w16du="http://schemas.microsoft.com/office/word/2023/wordml/word16du" xmlns:oel="http://schemas.microsoft.com/office/2019/extlst">
             <w:pict>
               <v:shape w14:anchorId="25EA92C4" id="Graphic 9" o:spid="_x0000_s1026" style="position:absolute;margin-left:57.75pt;margin-top:-5.45pt;width:96pt;height:110.25pt;z-index:15731712;visibility:visible;mso-wrap-style:square;mso-wrap-distance-left:0;mso-wrap-distance-top:0;mso-wrap-distance-right:0;mso-wrap-distance-bottom:0;mso-position-horizontal:absolute;mso-position-horizontal-relative:page;mso-position-vertical:absolute;mso-position-vertical-relative:text;v-text-anchor:top" coordsize="1219200,1400175" o:gfxdata="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" path="m,1400175r1219200,l1219200,,,,,1400175xe" filled="f">
                 <v:path arrowok="t"/>
@@ -3315,7 +3382,7 @@
               </wp:anchor>
             </w:drawing>
           </mc:Choice>
-          <mc:Fallback>
+          <mc:Fallback xmlns:w16sdtfl="http://schemas.microsoft.com/office/word/2024/wordml/sdtformatlock" xmlns:w16du="http://schemas.microsoft.com/office/word/2023/wordml/word16du" xmlns:oel="http://schemas.microsoft.com/office/2019/extlst">
             <w:pict>
               <v:shape w14:anchorId="03D5B984" id="Graphic 10" o:spid="_x0000_s1026" style="position:absolute;margin-left:205.95pt;margin-top:18.1pt;width:301.25pt;height:1.45pt;z-index:-15726592;visibility:visible;mso-wrap-style:square;mso-wrap-distance-left:0;mso-wrap-distance-top:0;mso-wrap-distance-right:0;mso-wrap-distance-bottom:0;mso-position-horizontal:absolute;mso-position-horizontal-relative:page;mso-position-vertical:absolute;mso-position-vertical-relative:text;v-text-anchor:top" coordsize="3825875,18415" o:gfxdata="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" path="m3825875,l,,,18287r3825875,l3825875,xe" fillcolor="black" stroked="f">
                 <v:path arrowok="t"/>
@@ -3535,7 +3602,7 @@
               </wp:anchor>
             </w:drawing>
           </mc:Choice>
-          <mc:Fallback>
+          <mc:Fallback xmlns:w16sdtfl="http://schemas.microsoft.com/office/word/2024/wordml/sdtformatlock" xmlns:w16du="http://schemas.microsoft.com/office/word/2023/wordml/word16du" xmlns:oel="http://schemas.microsoft.com/office/2019/extlst">
             <w:pict>
               <v:shape w14:anchorId="1BE2CA1D" id="Graphic 11" o:spid="_x0000_s1026" style="position:absolute;margin-left:92.2pt;margin-top:19pt;width:409.85pt;height:.1pt;z-index:-15726080;visibility:visible;mso-wrap-style:square;mso-wrap-distance-left:0;mso-wrap-distance-top:0;mso-wrap-distance-right:0;mso-wrap-distance-bottom:0;mso-position-horizontal:absolute;mso-position-horizontal-relative:page;mso-position-vertical:absolute;mso-position-vertical-relative:text;v-text-anchor:top" coordsize="5205095,1270" o:gfxdata="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" path="m,l5205095,e" filled="f">
                 <v:path arrowok="t"/>
@@ -3624,6 +3691,7 @@
         <w:rPr>
           <w:rFonts w:ascii="Microsoft Sans Serif" w:hAnsi="Microsoft Sans Serif"/>
           <w:sz w:val="18"/>
+          <w:lang w:val="en-US"/>
         </w:rPr>
       </w:pPr>
       <w:r>
@@ -3631,7 +3699,15 @@
           <w:rFonts w:ascii="Microsoft Sans Serif" w:hAnsi="Microsoft Sans Serif"/>
           <w:sz w:val="18"/>
         </w:rPr>
-        <w:t xml:space="preserve">Avenida Dorival Caymmi, 15.649 – Salvador/BA. CEP: 41.635-150 </w:t>
+        <w:t xml:space="preserve">Avenida Dorival Caymmi, 15.649 – Salvador/BA. </w:t>
+      </w:r>
+      <w:r>
+        <w:rPr>
+          <w:rFonts w:ascii="Microsoft Sans Serif" w:hAnsi="Microsoft Sans Serif"/>
+          <w:sz w:val="18"/>
+          <w:lang w:val="en-US"/>
+        </w:rPr>
+        <w:t xml:space="preserve">CEP: 41.635-150 </w:t>
       </w:r>
       <w:hyperlink r:id="rId7">
         <w:r>
@@ -3640,6 +3716,7 @@
             <w:spacing w:val="-2"/>
             <w:w w:val="105"/>
             <w:sz w:val="18"/>
+            <w:lang w:val="en-US"/>
           </w:rPr>
           <w:t>www.sdr.ba.gov.br</w:t>
         </w:r>
@@ -3650,6 +3727,7 @@
           <w:spacing w:val="-2"/>
           <w:w w:val="105"/>
           <w:sz w:val="18"/>
+          <w:lang w:val="en-US"/>
         </w:rPr>
         <w:t xml:space="preserve"> | </w:t>
       </w:r>
@@ -3660,6 +3738,7 @@
             <w:spacing w:val="-2"/>
             <w:w w:val="105"/>
             <w:sz w:val="18"/>
+            <w:lang w:val="en-US"/>
           </w:rPr>
           <w:t>www.bahiater.sdr.ba.gov.br</w:t>
         </w:r>
@@ -3675,8 +3754,55 @@
 </w:document>
 </file>
 
-<file path=word/numbering.xml><?xml version="1.0" encoding="utf-8"?>
-<w:numbering xmlns:wpc="http://schemas.microsoft.com/office/word/2010/wordprocessingCanvas" xmlns:cx="http://schemas.microsoft.com/office/drawing/2014/chartex" xmlns:cx1="http://schemas.microsoft.com/office/drawing/2015/9/8/chartex" xmlns:cx2="http://schemas.microsoft.com/office/drawing/2015/10/21/chartex" xmlns:cx3="http://schemas.microsoft.com/office/drawing/2016/5/9/chartex" xmlns:cx4="http://schemas.microsoft.com/office/drawing/2016/5/10/chartex" xmlns:cx5="http://schemas.microsoft.com/office/drawing/2016/5/11/chartex" xmlns:cx6="http://schemas.microsoft.com/office/drawing/2016/5/12/chartex" xmlns:cx7="http://schemas.microsoft.com/office/drawing/2016/5/13/chartex" xmlns:cx8="http://schemas.microsoft.com/office/drawing/2016/5/14/chartex" xmlns:mc="http://schemas.openxmlformats.org/markup-compatibility/2006" xmlns:aink="http://schemas.microsoft.com/office/drawing/2016/ink" xmlns:am3d="http://schemas.microsoft.com/office/drawing/2017/model3d" xmlns:o="urn:schemas-microsoft-com:office:office" xmlns:oel="http://schemas.microsoft.com/office/2019/extlst" xmlns:r="http://schemas.openxmlformats.org/officeDocument/2006/relationships" xmlns:m="http://schemas.openxmlformats.org/officeDocument/2006/math" xmlns:v="urn:schemas-microsoft-com:vml" xmlns:wp14="http://schemas.microsoft.com/office/word/2010/wordprocessingDrawing" xmlns:wp="http://schemas.openxmlformats.org/drawingml/2006/wordprocessingDrawing" xmlns:w10="urn:schemas-microsoft-com:office:word" xmlns:w="http://schemas.openxmlformats.org/wordprocessingml/2006/main" xmlns:w14="http://schemas.microsoft.com/office/word/2010/wordml" xmlns:w15="http://schemas.microsoft.com/office/word/2012/wordml" xmlns:w16cex="http://schemas.microsoft.com/office/word/2018/wordml/cex" xmlns:w16cid="http://schemas.microsoft.com/office/word/2016/wordml/cid" xmlns:w16="http://schemas.microsoft.com/office/word/2018/wordml" xmlns:w16du="http://schemas.microsoft.com/office/word/2023/wordml/word16du" xmlns:w16sdtdh="http://schemas.microsoft.com/office/word/2020/wordml/sdtdatahash" xmlns:w16sdtfl="http://schemas.microsoft.com/office/word/2024/wordml/sdtformatlock" xmlns:w16se="http://schemas.microsoft.com/office/word/2015/wordml/symex" xmlns:wpg="http://schemas.microsoft.com/office/word/2010/wordprocessingGroup" xmlns:wpi="http://schemas.microsoft.com/office/word/2010/wordprocessingInk" xmlns:wne="http://schemas.microsoft.com/office/word/2006/wordml" xmlns:wps="http://schemas.microsoft.com/office/word/2010/wordprocessingShape" mc:Ignorable="w14 w15 w16se w16cid w16 w16cex w16sdtdh w16sdtfl w16du wp14">
+<file path=word\fontTable.xml><?xml version="1.0" encoding="utf-8"?>
+<w:fonts xmlns:mc="http://schemas.openxmlformats.org/markup-compatibility/2006" xmlns:r="http://schemas.openxmlformats.org/officeDocument/2006/relationships" xmlns:w="http://schemas.openxmlformats.org/wordprocessingml/2006/main" xmlns:w14="http://schemas.microsoft.com/office/word/2010/wordml" xmlns:w15="http://schemas.microsoft.com/office/word/2012/wordml" xmlns:w16cex="http://schemas.microsoft.com/office/word/2018/wordml/cex" xmlns:w16cid="http://schemas.microsoft.com/office/word/2016/wordml/cid" xmlns:w16="http://schemas.microsoft.com/office/word/2018/wordml" xmlns:w16sdtdh="http://schemas.microsoft.com/office/word/2020/wordml/sdtdatahash" xmlns:w16se="http://schemas.microsoft.com/office/word/2015/wordml/symex" mc:Ignorable="w14 w15 w16se w16cid w16 w16cex w16sdtdh">
+  <w:font w:name="Microsoft Sans Serif">
+    <w:altName w:val="Microsoft Sans Serif"/>
+    <w:panose1 w:val="020B0604020202020204"/>
+    <w:charset w:val="00"/>
+    <w:family w:val="swiss"/>
+    <w:pitch w:val="variable"/>
+    <w:sig w:usb0="E5002EFF" w:usb1="C000605B" w:usb2="00000029" w:usb3="00000000" w:csb0="000101FF" w:csb1="00000000"/>
+  </w:font>
+  <w:font w:name="Times New Roman">
+    <w:panose1 w:val="02020603050405020304"/>
+    <w:charset w:val="00"/>
+    <w:family w:val="roman"/>
+    <w:pitch w:val="variable"/>
+    <w:sig w:usb0="E0002EFF" w:usb1="C000785B" w:usb2="00000009" w:usb3="00000000" w:csb0="000001FF" w:csb1="00000000"/>
+  </w:font>
+  <w:font w:name="Calibri">
+    <w:panose1 w:val="020F0502020204030204"/>
+    <w:charset w:val="00"/>
+    <w:family w:val="swiss"/>
+    <w:pitch w:val="variable"/>
+    <w:sig w:usb0="E4002EFF" w:usb1="C000247B" w:usb2="00000009" w:usb3="00000000" w:csb0="000001FF" w:csb1="00000000"/>
+  </w:font>
+  <w:font w:name="Arial">
+    <w:panose1 w:val="020B0604020202020204"/>
+    <w:charset w:val="00"/>
+    <w:family w:val="swiss"/>
+    <w:pitch w:val="variable"/>
+    <w:sig w:usb0="E0002EFF" w:usb1="C000785B" w:usb2="00000009" w:usb3="00000000" w:csb0="000001FF" w:csb1="00000000"/>
+  </w:font>
+  <w:font w:name="Cambria">
+    <w:panose1 w:val="02040503050406030204"/>
+    <w:charset w:val="00"/>
+    <w:family w:val="roman"/>
+    <w:pitch w:val="variable"/>
+    <w:sig w:usb0="E00006FF" w:usb1="420024FF" w:usb2="02000000" w:usb3="00000000" w:csb0="0000019F" w:csb1="00000000"/>
+  </w:font>
+  <w:font w:name="Arial MT">
+    <w:altName w:val="Arial"/>
+    <w:charset w:val="01"/>
+    <w:family w:val="swiss"/>
+    <w:pitch w:val="variable"/>
+  </w:font>
+</w:fonts>
+</file>
+
+<file path=word\numbering.xml><?xml version="1.0" encoding="utf-8"?>
+<w:numbering xmlns:wpc="http://schemas.microsoft.com/office/word/2010/wordprocessingCanvas" xmlns:cx="http://schemas.microsoft.com/office/drawing/2014/chartex" xmlns:cx1="http://schemas.microsoft.com/office/drawing/2015/9/8/chartex" xmlns:cx2="http://schemas.microsoft.com/office/drawing/2015/10/21/chartex" xmlns:cx3="http://schemas.microsoft.com/office/drawing/2016/5/9/chartex" xmlns:cx4="http://schemas.microsoft.com/office/drawing/2016/5/10/chartex" xmlns:cx5="http://schemas.microsoft.com/office/drawing/2016/5/11/chartex" xmlns:cx6="http://schemas.microsoft.com/office/drawing/2016/5/12/chartex" xmlns:cx7="http://schemas.microsoft.com/office/drawing/2016/5/13/chartex" xmlns:cx8="http://schemas.microsoft.com/office/drawing/2016/5/14/chartex" xmlns:mc="http://schemas.openxmlformats.org/markup-compatibility/2006" xmlns:aink="http://schemas.microsoft.com/office/drawing/2016/ink" xmlns:am3d="http://schemas.microsoft.com/office/drawing/2017/model3d" xmlns:o="urn:schemas-microsoft-com:office:office" xmlns:r="http://schemas.openxmlformats.org/officeDocument/2006/relationships" xmlns:m="http://schemas.openxmlformats.org/officeDocument/2006/math" xmlns:v="urn:schemas-microsoft-com:vml" xmlns:wp14="http://schemas.microsoft.com/office/word/2010/wordprocessingDrawing" xmlns:wp="http://schemas.openxmlformats.org/drawingml/2006/wordprocessingDrawing" xmlns:w10="urn:schemas-microsoft-com:office:word" xmlns:w="http://schemas.openxmlformats.org/wordprocessingml/2006/main" xmlns:w14="http://schemas.microsoft.com/office/word/2010/wordml" xmlns:w15="http://schemas.microsoft.com/office/word/2012/wordml" xmlns:w16cex="http://schemas.microsoft.com/office/word/2018/wordml/cex" xmlns:w16cid="http://schemas.microsoft.com/office/word/2016/wordml/cid" xmlns:w16="http://schemas.microsoft.com/office/word/2018/wordml" xmlns:w16sdtdh="http://schemas.microsoft.com/office/word/2020/wordml/sdtdatahash" xmlns:w16se="http://schemas.microsoft.com/office/word/2015/wordml/symex" xmlns:wpg="http://schemas.microsoft.com/office/word/2010/wordprocessingGroup" xmlns:wpi="http://schemas.microsoft.com/office/word/2010/wordprocessingInk" xmlns:wne="http://schemas.microsoft.com/office/word/2006/wordml" xmlns:wps="http://schemas.microsoft.com/office/word/2010/wordprocessingShape" mc:Ignorable="w14 w15 w16se w16cid w16 w16cex w16sdtdh wp14">
   <w:abstractNum w:abstractNumId="0" w15:restartNumberingAfterBreak="0">
     <w:nsid w:val="16C24F57"/>
     <w:multiLevelType w:val="hybridMultilevel"/>
@@ -3798,14 +3924,68 @@
       </w:rPr>
     </w:lvl>
   </w:abstractNum>
-  <w:num w:numId="1" w16cid:durableId="116261863">
+  <w:num w:numId="1">
     <w:abstractNumId w:val="0"/>
   </w:num>
 </w:numbering>
 </file>
 
-<file path=word/styles.xml><?xml version="1.0" encoding="utf-8"?>
-<w:styles xmlns:mc="http://schemas.openxmlformats.org/markup-compatibility/2006" xmlns:r="http://schemas.openxmlformats.org/officeDocument/2006/relationships" xmlns:w="http://schemas.openxmlformats.org/wordprocessingml/2006/main" xmlns:w14="http://schemas.microsoft.com/office/word/2010/wordml" xmlns:w15="http://schemas.microsoft.com/office/word/2012/wordml" xmlns:w16cex="http://schemas.microsoft.com/office/word/2018/wordml/cex" xmlns:w16cid="http://schemas.microsoft.com/office/word/2016/wordml/cid" xmlns:w16="http://schemas.microsoft.com/office/word/2018/wordml" xmlns:w16du="http://schemas.microsoft.com/office/word/2023/wordml/word16du" xmlns:w16sdtdh="http://schemas.microsoft.com/office/word/2020/wordml/sdtdatahash" xmlns:w16sdtfl="http://schemas.microsoft.com/office/word/2024/wordml/sdtformatlock" xmlns:w16se="http://schemas.microsoft.com/office/word/2015/wordml/symex" mc:Ignorable="w14 w15 w16se w16cid w16 w16cex w16sdtdh w16sdtfl w16du">
+<file path=word\settings.xml><?xml version="1.0" encoding="utf-8"?>
+<w:settings xmlns:mc="http://schemas.openxmlformats.org/markup-compatibility/2006" xmlns:o="urn:schemas-microsoft-com:office:office" xmlns:r="http://schemas.openxmlformats.org/officeDocument/2006/relationships" xmlns:m="http://schemas.openxmlformats.org/officeDocument/2006/math" xmlns:v="urn:schemas-microsoft-com:vml" xmlns:w10="urn:schemas-microsoft-com:office:word" xmlns:w="http://schemas.openxmlformats.org/wordprocessingml/2006/main" xmlns:w14="http://schemas.microsoft.com/office/word/2010/wordml" xmlns:w15="http://schemas.microsoft.com/office/word/2012/wordml" xmlns:w16cex="http://schemas.microsoft.com/office/word/2018/wordml/cex" xmlns:w16cid="http://schemas.microsoft.com/office/word/2016/wordml/cid" xmlns:w16="http://schemas.microsoft.com/office/word/2018/wordml" xmlns:w16sdtdh="http://schemas.microsoft.com/office/word/2020/wordml/sdtdatahash" xmlns:w16se="http://schemas.microsoft.com/office/word/2015/wordml/symex" xmlns:sl="http://schemas.openxmlformats.org/schemaLibrary/2006/main" mc:Ignorable="w14 w15 w16se w16cid w16 w16cex w16sdtdh">
+  <w:zoom w:percent="100"/>
+  <w:defaultTabStop w:val="720"/>
+  <w:hyphenationZone w:val="425"/>
+  <w:drawingGridHorizontalSpacing w:val="110"/>
+  <w:displayHorizontalDrawingGridEvery w:val="2"/>
+  <w:characterSpacingControl w:val="doNotCompress"/>
+  <w:compat>
+    <w:ulTrailSpace/>
+    <w:compatSetting w:name="compatibilityMode" w:uri="http://schemas.microsoft.com/office/word" w:val="15"/>
+    <w:compatSetting w:name="overrideTableStyleFontSizeAndJustification" w:uri="http://schemas.microsoft.com/office/word" w:val="1"/>
+    <w:compatSetting w:name="enableOpenTypeFeatures" w:uri="http://schemas.microsoft.com/office/word" w:val="1"/>
+    <w:compatSetting w:name="doNotFlipMirrorIndents" w:uri="http://schemas.microsoft.com/office/word" w:val="1"/>
+    <w:compatSetting w:name="differentiateMultirowTableHeaders" w:uri="http://schemas.microsoft.com/office/word" w:val="1"/>
+    <w:compatSetting w:name="useWord2013TrackBottomHyphenation" w:uri="http://schemas.microsoft.com/office/word" w:val="1"/>
+  </w:compat>
+  <w:rsids>
+    <w:rsidRoot w:val="00A43B55"/>
+    <w:rsid w:val="00002621"/>
+    <w:rsid w:val="00042A63"/>
+    <w:rsid w:val="00116E4E"/>
+    <w:rsid w:val="00423387"/>
+    <w:rsid w:val="007106D5"/>
+    <w:rsid w:val="00A43B55"/>
+  </w:rsids>
+  <m:mathPr>
+    <m:mathFont m:val="Cambria Math"/>
+    <m:brkBin m:val="before"/>
+    <m:brkBinSub m:val="--"/>
+    <m:smallFrac m:val="0"/>
+    <m:dispDef/>
+    <m:lMargin m:val="0"/>
+    <m:rMargin m:val="0"/>
+    <m:defJc m:val="centerGroup"/>
+    <m:wrapIndent m:val="1440"/>
+    <m:intLim m:val="subSup"/>
+    <m:naryLim m:val="undOvr"/>
+  </m:mathPr>
+  <w:themeFontLang w:val="pt-BR"/>
+  <w:clrSchemeMapping w:bg1="light1" w:t1="dark1" w:bg2="light2" w:t2="dark2" w:accent1="accent1" w:accent2="accent2" w:accent3="accent3" w:accent4="accent4" w:accent5="accent5" w:accent6="accent6" w:hyperlink="hyperlink" w:followedHyperlink="followedHyperlink"/>
+  <w:shapeDefaults>
+    <o:shapedefaults v:ext="edit" spidmax="1026"/>
+    <o:shapelayout v:ext="edit">
+      <o:idmap v:ext="edit" data="1"/>
+    </o:shapelayout>
+  </w:shapeDefaults>
+  <w:decimalSymbol w:val=","/>
+  <w:listSeparator w:val=";"/>
+  <w14:docId w14:val="378FBBD7"/>
+  <w15:docId w15:val="{12E7A569-A41C-426B-89AD-0512E735AEEE}"/>
+</w:settings>
+</file>
+
+<file path=word\styles.xml><?xml version="1.0" encoding="utf-8"?>
+<w:styles xmlns:mc="http://schemas.openxmlformats.org/markup-compatibility/2006" xmlns:r="http://schemas.openxmlformats.org/officeDocument/2006/relationships" xmlns:w="http://schemas.openxmlformats.org/wordprocessingml/2006/main" xmlns:w14="http://schemas.microsoft.com/office/word/2010/wordml" xmlns:w15="http://schemas.microsoft.com/office/word/2012/wordml" xmlns:w16cex="http://schemas.microsoft.com/office/word/2018/wordml/cex" xmlns:w16cid="http://schemas.microsoft.com/office/word/2016/wordml/cid" xmlns:w16="http://schemas.microsoft.com/office/word/2018/wordml" xmlns:w16sdtdh="http://schemas.microsoft.com/office/word/2020/wordml/sdtdatahash" xmlns:w16se="http://schemas.microsoft.com/office/word/2015/wordml/symex" mc:Ignorable="w14 w15 w16se w16cid w16 w16cex w16sdtdh">
   <w:docDefaults>
     <w:rPrDefault>
       <w:rPr>
@@ -4321,7 +4501,7 @@
 </w:styles>
 </file>
 
-<file path=word/theme/theme1.xml><?xml version="1.0" encoding="utf-8"?>
+<file path=word\theme\theme1.xml><?xml version="1.0" encoding="utf-8"?>
 <a:theme xmlns:a="http://schemas.openxmlformats.org/drawingml/2006/main" name="Office Theme">
   <a:themeElements>
     <a:clrScheme name="Office">
@@ -4602,4 +4782,11 @@
   <a:objectDefaults/>
   <a:extraClrSchemeLst/>
 </a:theme>
+</file>
+
+<file path=word\webSettings.xml><?xml version="1.0" encoding="utf-8"?>
+<w:webSettings xmlns:mc="http://schemas.openxmlformats.org/markup-compatibility/2006" xmlns:r="http://schemas.openxmlformats.org/officeDocument/2006/relationships" xmlns:w="http://schemas.openxmlformats.org/wordprocessingml/2006/main" xmlns:w14="http://schemas.microsoft.com/office/word/2010/wordml" xmlns:w15="http://schemas.microsoft.com/office/word/2012/wordml" xmlns:w16cex="http://schemas.microsoft.com/office/word/2018/wordml/cex" xmlns:w16cid="http://schemas.microsoft.com/office/word/2016/wordml/cid" xmlns:w16="http://schemas.microsoft.com/office/word/2018/wordml" xmlns:w16sdtdh="http://schemas.microsoft.com/office/word/2020/wordml/sdtdatahash" xmlns:w16se="http://schemas.microsoft.com/office/word/2015/wordml/symex" mc:Ignorable="w14 w15 w16se w16cid w16 w16cex w16sdtdh">
+  <w:relyOnVML/>
+  <w:allowPNG/>
+</w:webSettings>
 </file>
</xml_diff>

<commit_message>
feat: add atestes.docx to bahia_sem_fome module assets
</commit_message>
<xml_diff>
--- a/app/modules/bahia_sem_fome/assets/atestes.docx
+++ b/app/modules/bahia_sem_fome/assets/atestes.docx
@@ -1,5 +1,24 @@
 
-<file path=docProps\app.xml><?xml version="1.0" encoding="utf-8"?>
+<file path=./[Content_Types].xml><?xml version="1.0" encoding="utf-8"?>
+<Types xmlns="http://schemas.openxmlformats.org/package/2006/content-types">
+  <Default Extension="jpeg" ContentType="image/jpeg"/>
+  <Default Extension="png" ContentType="image/png"/>
+  <Default Extension="rels" ContentType="application/vnd.openxmlformats-package.relationships+xml"/>
+  <Default Extension="xml" ContentType="application/xml"/>
+  <Override PartName="/word/document.xml" ContentType="application/vnd.openxmlformats-officedocument.wordprocessingml.document.main+xml"/>
+  <Override PartName="/word/numbering.xml" ContentType="application/vnd.openxmlformats-officedocument.wordprocessingml.numbering+xml"/>
+  <Override PartName="/word/styles.xml" ContentType="application/vnd.openxmlformats-officedocument.wordprocessingml.styles+xml"/>
+  <Override PartName="/word/settings.xml" ContentType="application/vnd.openxmlformats-officedocument.wordprocessingml.settings+xml"/>
+  <Override PartName="/word/webSettings.xml" ContentType="application/vnd.openxmlformats-officedocument.wordprocessingml.webSettings+xml"/>
+  <Override PartName="/word/fontTable.xml" ContentType="application/vnd.openxmlformats-officedocument.wordprocessingml.fontTable+xml"/>
+  <Override PartName="/word/theme/theme1.xml" ContentType="application/vnd.openxmlformats-officedocument.theme+xml"/>
+  <Override PartName="/docProps/core.xml" ContentType="application/vnd.openxmlformats-package.core-properties+xml"/>
+  <Override PartName="/docProps/app.xml" ContentType="application/vnd.openxmlformats-officedocument.extended-properties+xml"/>
+  <Override PartName="/docProps/custom.xml" ContentType="application/vnd.openxmlformats-officedocument.custom-properties+xml"/>
+</Types>
+</file>
+
+<file path=./docProps/app.xml><?xml version="1.0" encoding="utf-8"?>
 <Properties xmlns="http://schemas.openxmlformats.org/officeDocument/2006/extended-properties" xmlns:vt="http://schemas.openxmlformats.org/officeDocument/2006/docPropsVTypes">
   <Template>Normal</Template>
   <TotalTime>3</TotalTime>
@@ -35,7 +54,7 @@
 </Properties>
 </file>
 
-<file path=docProps\core.xml><?xml version="1.0" encoding="utf-8"?>
+<file path=./docProps/core.xml><?xml version="1.0" encoding="utf-8"?>
 <cp:coreProperties xmlns:cp="http://schemas.openxmlformats.org/package/2006/metadata/core-properties" xmlns:dc="http://purl.org/dc/elements/1.1/" xmlns:dcterms="http://purl.org/dc/terms/" xmlns:dcmitype="http://purl.org/dc/dcmitype/" xmlns:xsi="http://www.w3.org/2001/XMLSchema-instance">
   <dc:creator>ovidio</dc:creator>
   <cp:lastModifiedBy>CLIENTE</cp:lastModifiedBy>
@@ -45,7 +64,7 @@
 </cp:coreProperties>
 </file>
 
-<file path=docProps\custom.xml><?xml version="1.0" encoding="utf-8"?>
+<file path=./docProps/custom.xml><?xml version="1.0" encoding="utf-8"?>
 <Properties xmlns="http://schemas.openxmlformats.org/officeDocument/2006/custom-properties" xmlns:vt="http://schemas.openxmlformats.org/officeDocument/2006/docPropsVTypes">
   <property fmtid="{D5CDD505-2E9C-101B-9397-08002B2CF9AE}" pid="2" name="Converter">
     <vt:lpwstr>SolidFramework v10.0.19910.1</vt:lpwstr>
@@ -65,7 +84,7 @@
 </Properties>
 </file>
 
-<file path=word\document.xml><?xml version="1.0" encoding="utf-8"?>
+<file path=./word/document.xml><?xml version="1.0" encoding="utf-8"?>
 <w:document xmlns:wpc="http://schemas.microsoft.com/office/word/2010/wordprocessingCanvas" xmlns:cx="http://schemas.microsoft.com/office/drawing/2014/chartex" xmlns:cx1="http://schemas.microsoft.com/office/drawing/2015/9/8/chartex" xmlns:cx2="http://schemas.microsoft.com/office/drawing/2015/10/21/chartex" xmlns:cx3="http://schemas.microsoft.com/office/drawing/2016/5/9/chartex" xmlns:cx4="http://schemas.microsoft.com/office/drawing/2016/5/10/chartex" xmlns:cx5="http://schemas.microsoft.com/office/drawing/2016/5/11/chartex" xmlns:cx6="http://schemas.microsoft.com/office/drawing/2016/5/12/chartex" xmlns:cx7="http://schemas.microsoft.com/office/drawing/2016/5/13/chartex" xmlns:cx8="http://schemas.microsoft.com/office/drawing/2016/5/14/chartex" xmlns:mc="http://schemas.openxmlformats.org/markup-compatibility/2006" xmlns:aink="http://schemas.microsoft.com/office/drawing/2016/ink" xmlns:am3d="http://schemas.microsoft.com/office/drawing/2017/model3d" xmlns:o="urn:schemas-microsoft-com:office:office" xmlns:r="http://schemas.openxmlformats.org/officeDocument/2006/relationships" xmlns:m="http://schemas.openxmlformats.org/officeDocument/2006/math" xmlns:v="urn:schemas-microsoft-com:vml" xmlns:wp14="http://schemas.microsoft.com/office/word/2010/wordprocessingDrawing" xmlns:wp="http://schemas.openxmlformats.org/drawingml/2006/wordprocessingDrawing" xmlns:w10="urn:schemas-microsoft-com:office:word" xmlns:w="http://schemas.openxmlformats.org/wordprocessingml/2006/main" xmlns:w14="http://schemas.microsoft.com/office/word/2010/wordml" xmlns:w15="http://schemas.microsoft.com/office/word/2012/wordml" xmlns:w16cex="http://schemas.microsoft.com/office/word/2018/wordml/cex" xmlns:w16cid="http://schemas.microsoft.com/office/word/2016/wordml/cid" xmlns:w16="http://schemas.microsoft.com/office/word/2018/wordml" xmlns:w16sdtdh="http://schemas.microsoft.com/office/word/2020/wordml/sdtdatahash" xmlns:w16se="http://schemas.microsoft.com/office/word/2015/wordml/symex" xmlns:wpg="http://schemas.microsoft.com/office/word/2010/wordprocessingGroup" xmlns:wpi="http://schemas.microsoft.com/office/word/2010/wordprocessingInk" xmlns:wne="http://schemas.microsoft.com/office/word/2006/wordml" xmlns:wps="http://schemas.microsoft.com/office/word/2010/wordprocessingShape" mc:Ignorable="w14 w15 w16se w16cid w16 w16cex w16sdtdh wp14">
   <w:body>
     <w:p>
@@ -1349,7 +1368,7 @@
                 <w:sz w:val="20"/>
                 <w:szCs w:val="20"/>
               </w:rPr>
-              <w:t>{{cpf_beneficiario}}</w:t>
+              <w:t>{{{cpf_beneficiario}}</w:t>
             </w:r>
           </w:p>
         </w:tc>
@@ -3754,7 +3773,7 @@
 </w:document>
 </file>
 
-<file path=word\fontTable.xml><?xml version="1.0" encoding="utf-8"?>
+<file path=./word/fontTable.xml><?xml version="1.0" encoding="utf-8"?>
 <w:fonts xmlns:mc="http://schemas.openxmlformats.org/markup-compatibility/2006" xmlns:r="http://schemas.openxmlformats.org/officeDocument/2006/relationships" xmlns:w="http://schemas.openxmlformats.org/wordprocessingml/2006/main" xmlns:w14="http://schemas.microsoft.com/office/word/2010/wordml" xmlns:w15="http://schemas.microsoft.com/office/word/2012/wordml" xmlns:w16cex="http://schemas.microsoft.com/office/word/2018/wordml/cex" xmlns:w16cid="http://schemas.microsoft.com/office/word/2016/wordml/cid" xmlns:w16="http://schemas.microsoft.com/office/word/2018/wordml" xmlns:w16sdtdh="http://schemas.microsoft.com/office/word/2020/wordml/sdtdatahash" xmlns:w16se="http://schemas.microsoft.com/office/word/2015/wordml/symex" mc:Ignorable="w14 w15 w16se w16cid w16 w16cex w16sdtdh">
   <w:font w:name="Microsoft Sans Serif">
     <w:altName w:val="Microsoft Sans Serif"/>
@@ -3801,7 +3820,7 @@
 </w:fonts>
 </file>
 
-<file path=word\numbering.xml><?xml version="1.0" encoding="utf-8"?>
+<file path=./word/numbering.xml><?xml version="1.0" encoding="utf-8"?>
 <w:numbering xmlns:wpc="http://schemas.microsoft.com/office/word/2010/wordprocessingCanvas" xmlns:cx="http://schemas.microsoft.com/office/drawing/2014/chartex" xmlns:cx1="http://schemas.microsoft.com/office/drawing/2015/9/8/chartex" xmlns:cx2="http://schemas.microsoft.com/office/drawing/2015/10/21/chartex" xmlns:cx3="http://schemas.microsoft.com/office/drawing/2016/5/9/chartex" xmlns:cx4="http://schemas.microsoft.com/office/drawing/2016/5/10/chartex" xmlns:cx5="http://schemas.microsoft.com/office/drawing/2016/5/11/chartex" xmlns:cx6="http://schemas.microsoft.com/office/drawing/2016/5/12/chartex" xmlns:cx7="http://schemas.microsoft.com/office/drawing/2016/5/13/chartex" xmlns:cx8="http://schemas.microsoft.com/office/drawing/2016/5/14/chartex" xmlns:mc="http://schemas.openxmlformats.org/markup-compatibility/2006" xmlns:aink="http://schemas.microsoft.com/office/drawing/2016/ink" xmlns:am3d="http://schemas.microsoft.com/office/drawing/2017/model3d" xmlns:o="urn:schemas-microsoft-com:office:office" xmlns:r="http://schemas.openxmlformats.org/officeDocument/2006/relationships" xmlns:m="http://schemas.openxmlformats.org/officeDocument/2006/math" xmlns:v="urn:schemas-microsoft-com:vml" xmlns:wp14="http://schemas.microsoft.com/office/word/2010/wordprocessingDrawing" xmlns:wp="http://schemas.openxmlformats.org/drawingml/2006/wordprocessingDrawing" xmlns:w10="urn:schemas-microsoft-com:office:word" xmlns:w="http://schemas.openxmlformats.org/wordprocessingml/2006/main" xmlns:w14="http://schemas.microsoft.com/office/word/2010/wordml" xmlns:w15="http://schemas.microsoft.com/office/word/2012/wordml" xmlns:w16cex="http://schemas.microsoft.com/office/word/2018/wordml/cex" xmlns:w16cid="http://schemas.microsoft.com/office/word/2016/wordml/cid" xmlns:w16="http://schemas.microsoft.com/office/word/2018/wordml" xmlns:w16sdtdh="http://schemas.microsoft.com/office/word/2020/wordml/sdtdatahash" xmlns:w16se="http://schemas.microsoft.com/office/word/2015/wordml/symex" xmlns:wpg="http://schemas.microsoft.com/office/word/2010/wordprocessingGroup" xmlns:wpi="http://schemas.microsoft.com/office/word/2010/wordprocessingInk" xmlns:wne="http://schemas.microsoft.com/office/word/2006/wordml" xmlns:wps="http://schemas.microsoft.com/office/word/2010/wordprocessingShape" mc:Ignorable="w14 w15 w16se w16cid w16 w16cex w16sdtdh wp14">
   <w:abstractNum w:abstractNumId="0" w15:restartNumberingAfterBreak="0">
     <w:nsid w:val="16C24F57"/>
@@ -3930,7 +3949,7 @@
 </w:numbering>
 </file>
 
-<file path=word\settings.xml><?xml version="1.0" encoding="utf-8"?>
+<file path=./word/settings.xml><?xml version="1.0" encoding="utf-8"?>
 <w:settings xmlns:mc="http://schemas.openxmlformats.org/markup-compatibility/2006" xmlns:o="urn:schemas-microsoft-com:office:office" xmlns:r="http://schemas.openxmlformats.org/officeDocument/2006/relationships" xmlns:m="http://schemas.openxmlformats.org/officeDocument/2006/math" xmlns:v="urn:schemas-microsoft-com:vml" xmlns:w10="urn:schemas-microsoft-com:office:word" xmlns:w="http://schemas.openxmlformats.org/wordprocessingml/2006/main" xmlns:w14="http://schemas.microsoft.com/office/word/2010/wordml" xmlns:w15="http://schemas.microsoft.com/office/word/2012/wordml" xmlns:w16cex="http://schemas.microsoft.com/office/word/2018/wordml/cex" xmlns:w16cid="http://schemas.microsoft.com/office/word/2016/wordml/cid" xmlns:w16="http://schemas.microsoft.com/office/word/2018/wordml" xmlns:w16sdtdh="http://schemas.microsoft.com/office/word/2020/wordml/sdtdatahash" xmlns:w16se="http://schemas.microsoft.com/office/word/2015/wordml/symex" xmlns:sl="http://schemas.openxmlformats.org/schemaLibrary/2006/main" mc:Ignorable="w14 w15 w16se w16cid w16 w16cex w16sdtdh">
   <w:zoom w:percent="100"/>
   <w:defaultTabStop w:val="720"/>
@@ -3984,7 +4003,7 @@
 </w:settings>
 </file>
 
-<file path=word\styles.xml><?xml version="1.0" encoding="utf-8"?>
+<file path=./word/styles.xml><?xml version="1.0" encoding="utf-8"?>
 <w:styles xmlns:mc="http://schemas.openxmlformats.org/markup-compatibility/2006" xmlns:r="http://schemas.openxmlformats.org/officeDocument/2006/relationships" xmlns:w="http://schemas.openxmlformats.org/wordprocessingml/2006/main" xmlns:w14="http://schemas.microsoft.com/office/word/2010/wordml" xmlns:w15="http://schemas.microsoft.com/office/word/2012/wordml" xmlns:w16cex="http://schemas.microsoft.com/office/word/2018/wordml/cex" xmlns:w16cid="http://schemas.microsoft.com/office/word/2016/wordml/cid" xmlns:w16="http://schemas.microsoft.com/office/word/2018/wordml" xmlns:w16sdtdh="http://schemas.microsoft.com/office/word/2020/wordml/sdtdatahash" xmlns:w16se="http://schemas.microsoft.com/office/word/2015/wordml/symex" mc:Ignorable="w14 w15 w16se w16cid w16 w16cex w16sdtdh">
   <w:docDefaults>
     <w:rPrDefault>
@@ -4501,7 +4520,7 @@
 </w:styles>
 </file>
 
-<file path=word\theme\theme1.xml><?xml version="1.0" encoding="utf-8"?>
+<file path=./word/theme/theme1.xml><?xml version="1.0" encoding="utf-8"?>
 <a:theme xmlns:a="http://schemas.openxmlformats.org/drawingml/2006/main" name="Office Theme">
   <a:themeElements>
     <a:clrScheme name="Office">
@@ -4784,7 +4803,7 @@
 </a:theme>
 </file>
 
-<file path=word\webSettings.xml><?xml version="1.0" encoding="utf-8"?>
+<file path=./word/webSettings.xml><?xml version="1.0" encoding="utf-8"?>
 <w:webSettings xmlns:mc="http://schemas.openxmlformats.org/markup-compatibility/2006" xmlns:r="http://schemas.openxmlformats.org/officeDocument/2006/relationships" xmlns:w="http://schemas.openxmlformats.org/wordprocessingml/2006/main" xmlns:w14="http://schemas.microsoft.com/office/word/2010/wordml" xmlns:w15="http://schemas.microsoft.com/office/word/2012/wordml" xmlns:w16cex="http://schemas.microsoft.com/office/word/2018/wordml/cex" xmlns:w16cid="http://schemas.microsoft.com/office/word/2016/wordml/cid" xmlns:w16="http://schemas.microsoft.com/office/word/2018/wordml" xmlns:w16sdtdh="http://schemas.microsoft.com/office/word/2020/wordml/sdtdatahash" xmlns:w16se="http://schemas.microsoft.com/office/word/2015/wordml/symex" mc:Ignorable="w14 w15 w16se w16cid w16 w16cex w16sdtdh">
   <w:relyOnVML/>
   <w:allowPNG/>

</xml_diff>

<commit_message>
feat: implement file upload and processing logic for Bahia Sem Fome atestes generation
</commit_message>
<xml_diff>
--- a/app/modules/bahia_sem_fome/assets/atestes.docx
+++ b/app/modules/bahia_sem_fome/assets/atestes.docx
@@ -1,24 +1,5 @@
 
-<file path=./[Content_Types].xml><?xml version="1.0" encoding="utf-8"?>
-<Types xmlns="http://schemas.openxmlformats.org/package/2006/content-types">
-  <Default Extension="jpeg" ContentType="image/jpeg"/>
-  <Default Extension="png" ContentType="image/png"/>
-  <Default Extension="rels" ContentType="application/vnd.openxmlformats-package.relationships+xml"/>
-  <Default Extension="xml" ContentType="application/xml"/>
-  <Override PartName="/word/document.xml" ContentType="application/vnd.openxmlformats-officedocument.wordprocessingml.document.main+xml"/>
-  <Override PartName="/word/numbering.xml" ContentType="application/vnd.openxmlformats-officedocument.wordprocessingml.numbering+xml"/>
-  <Override PartName="/word/styles.xml" ContentType="application/vnd.openxmlformats-officedocument.wordprocessingml.styles+xml"/>
-  <Override PartName="/word/settings.xml" ContentType="application/vnd.openxmlformats-officedocument.wordprocessingml.settings+xml"/>
-  <Override PartName="/word/webSettings.xml" ContentType="application/vnd.openxmlformats-officedocument.wordprocessingml.webSettings+xml"/>
-  <Override PartName="/word/fontTable.xml" ContentType="application/vnd.openxmlformats-officedocument.wordprocessingml.fontTable+xml"/>
-  <Override PartName="/word/theme/theme1.xml" ContentType="application/vnd.openxmlformats-officedocument.theme+xml"/>
-  <Override PartName="/docProps/core.xml" ContentType="application/vnd.openxmlformats-package.core-properties+xml"/>
-  <Override PartName="/docProps/app.xml" ContentType="application/vnd.openxmlformats-officedocument.extended-properties+xml"/>
-  <Override PartName="/docProps/custom.xml" ContentType="application/vnd.openxmlformats-officedocument.custom-properties+xml"/>
-</Types>
-</file>
-
-<file path=./docProps/app.xml><?xml version="1.0" encoding="utf-8"?>
+<file path=docProps\app.xml><?xml version="1.0" encoding="utf-8"?>
 <Properties xmlns="http://schemas.openxmlformats.org/officeDocument/2006/extended-properties" xmlns:vt="http://schemas.openxmlformats.org/officeDocument/2006/docPropsVTypes">
   <Template>Normal</Template>
   <TotalTime>3</TotalTime>
@@ -54,7 +35,7 @@
 </Properties>
 </file>
 
-<file path=./docProps/core.xml><?xml version="1.0" encoding="utf-8"?>
+<file path=docProps\core.xml><?xml version="1.0" encoding="utf-8"?>
 <cp:coreProperties xmlns:cp="http://schemas.openxmlformats.org/package/2006/metadata/core-properties" xmlns:dc="http://purl.org/dc/elements/1.1/" xmlns:dcterms="http://purl.org/dc/terms/" xmlns:dcmitype="http://purl.org/dc/dcmitype/" xmlns:xsi="http://www.w3.org/2001/XMLSchema-instance">
   <dc:creator>ovidio</dc:creator>
   <cp:lastModifiedBy>CLIENTE</cp:lastModifiedBy>
@@ -64,7 +45,7 @@
 </cp:coreProperties>
 </file>
 
-<file path=./docProps/custom.xml><?xml version="1.0" encoding="utf-8"?>
+<file path=docProps\custom.xml><?xml version="1.0" encoding="utf-8"?>
 <Properties xmlns="http://schemas.openxmlformats.org/officeDocument/2006/custom-properties" xmlns:vt="http://schemas.openxmlformats.org/officeDocument/2006/docPropsVTypes">
   <property fmtid="{D5CDD505-2E9C-101B-9397-08002B2CF9AE}" pid="2" name="Converter">
     <vt:lpwstr>SolidFramework v10.0.19910.1</vt:lpwstr>
@@ -84,7 +65,7 @@
 </Properties>
 </file>
 
-<file path=./word/document.xml><?xml version="1.0" encoding="utf-8"?>
+<file path=word\document.xml><?xml version="1.0" encoding="utf-8"?>
 <w:document xmlns:wpc="http://schemas.microsoft.com/office/word/2010/wordprocessingCanvas" xmlns:cx="http://schemas.microsoft.com/office/drawing/2014/chartex" xmlns:cx1="http://schemas.microsoft.com/office/drawing/2015/9/8/chartex" xmlns:cx2="http://schemas.microsoft.com/office/drawing/2015/10/21/chartex" xmlns:cx3="http://schemas.microsoft.com/office/drawing/2016/5/9/chartex" xmlns:cx4="http://schemas.microsoft.com/office/drawing/2016/5/10/chartex" xmlns:cx5="http://schemas.microsoft.com/office/drawing/2016/5/11/chartex" xmlns:cx6="http://schemas.microsoft.com/office/drawing/2016/5/12/chartex" xmlns:cx7="http://schemas.microsoft.com/office/drawing/2016/5/13/chartex" xmlns:cx8="http://schemas.microsoft.com/office/drawing/2016/5/14/chartex" xmlns:mc="http://schemas.openxmlformats.org/markup-compatibility/2006" xmlns:aink="http://schemas.microsoft.com/office/drawing/2016/ink" xmlns:am3d="http://schemas.microsoft.com/office/drawing/2017/model3d" xmlns:o="urn:schemas-microsoft-com:office:office" xmlns:r="http://schemas.openxmlformats.org/officeDocument/2006/relationships" xmlns:m="http://schemas.openxmlformats.org/officeDocument/2006/math" xmlns:v="urn:schemas-microsoft-com:vml" xmlns:wp14="http://schemas.microsoft.com/office/word/2010/wordprocessingDrawing" xmlns:wp="http://schemas.openxmlformats.org/drawingml/2006/wordprocessingDrawing" xmlns:w10="urn:schemas-microsoft-com:office:word" xmlns:w="http://schemas.openxmlformats.org/wordprocessingml/2006/main" xmlns:w14="http://schemas.microsoft.com/office/word/2010/wordml" xmlns:w15="http://schemas.microsoft.com/office/word/2012/wordml" xmlns:w16cex="http://schemas.microsoft.com/office/word/2018/wordml/cex" xmlns:w16cid="http://schemas.microsoft.com/office/word/2016/wordml/cid" xmlns:w16="http://schemas.microsoft.com/office/word/2018/wordml" xmlns:w16sdtdh="http://schemas.microsoft.com/office/word/2020/wordml/sdtdatahash" xmlns:w16se="http://schemas.microsoft.com/office/word/2015/wordml/symex" xmlns:wpg="http://schemas.microsoft.com/office/word/2010/wordprocessingGroup" xmlns:wpi="http://schemas.microsoft.com/office/word/2010/wordprocessingInk" xmlns:wne="http://schemas.microsoft.com/office/word/2006/wordml" xmlns:wps="http://schemas.microsoft.com/office/word/2010/wordprocessingShape" mc:Ignorable="w14 w15 w16se w16cid w16 w16cex w16sdtdh wp14">
   <w:body>
     <w:p>
@@ -1368,7 +1349,7 @@
                 <w:sz w:val="20"/>
                 <w:szCs w:val="20"/>
               </w:rPr>
-              <w:t>{{{cpf_beneficiario}}</w:t>
+              <w:t>{{{{cpf_beneficiario}}</w:t>
             </w:r>
           </w:p>
         </w:tc>
@@ -3773,7 +3754,7 @@
 </w:document>
 </file>
 
-<file path=./word/fontTable.xml><?xml version="1.0" encoding="utf-8"?>
+<file path=word\fontTable.xml><?xml version="1.0" encoding="utf-8"?>
 <w:fonts xmlns:mc="http://schemas.openxmlformats.org/markup-compatibility/2006" xmlns:r="http://schemas.openxmlformats.org/officeDocument/2006/relationships" xmlns:w="http://schemas.openxmlformats.org/wordprocessingml/2006/main" xmlns:w14="http://schemas.microsoft.com/office/word/2010/wordml" xmlns:w15="http://schemas.microsoft.com/office/word/2012/wordml" xmlns:w16cex="http://schemas.microsoft.com/office/word/2018/wordml/cex" xmlns:w16cid="http://schemas.microsoft.com/office/word/2016/wordml/cid" xmlns:w16="http://schemas.microsoft.com/office/word/2018/wordml" xmlns:w16sdtdh="http://schemas.microsoft.com/office/word/2020/wordml/sdtdatahash" xmlns:w16se="http://schemas.microsoft.com/office/word/2015/wordml/symex" mc:Ignorable="w14 w15 w16se w16cid w16 w16cex w16sdtdh">
   <w:font w:name="Microsoft Sans Serif">
     <w:altName w:val="Microsoft Sans Serif"/>
@@ -3820,7 +3801,7 @@
 </w:fonts>
 </file>
 
-<file path=./word/numbering.xml><?xml version="1.0" encoding="utf-8"?>
+<file path=word\numbering.xml><?xml version="1.0" encoding="utf-8"?>
 <w:numbering xmlns:wpc="http://schemas.microsoft.com/office/word/2010/wordprocessingCanvas" xmlns:cx="http://schemas.microsoft.com/office/drawing/2014/chartex" xmlns:cx1="http://schemas.microsoft.com/office/drawing/2015/9/8/chartex" xmlns:cx2="http://schemas.microsoft.com/office/drawing/2015/10/21/chartex" xmlns:cx3="http://schemas.microsoft.com/office/drawing/2016/5/9/chartex" xmlns:cx4="http://schemas.microsoft.com/office/drawing/2016/5/10/chartex" xmlns:cx5="http://schemas.microsoft.com/office/drawing/2016/5/11/chartex" xmlns:cx6="http://schemas.microsoft.com/office/drawing/2016/5/12/chartex" xmlns:cx7="http://schemas.microsoft.com/office/drawing/2016/5/13/chartex" xmlns:cx8="http://schemas.microsoft.com/office/drawing/2016/5/14/chartex" xmlns:mc="http://schemas.openxmlformats.org/markup-compatibility/2006" xmlns:aink="http://schemas.microsoft.com/office/drawing/2016/ink" xmlns:am3d="http://schemas.microsoft.com/office/drawing/2017/model3d" xmlns:o="urn:schemas-microsoft-com:office:office" xmlns:r="http://schemas.openxmlformats.org/officeDocument/2006/relationships" xmlns:m="http://schemas.openxmlformats.org/officeDocument/2006/math" xmlns:v="urn:schemas-microsoft-com:vml" xmlns:wp14="http://schemas.microsoft.com/office/word/2010/wordprocessingDrawing" xmlns:wp="http://schemas.openxmlformats.org/drawingml/2006/wordprocessingDrawing" xmlns:w10="urn:schemas-microsoft-com:office:word" xmlns:w="http://schemas.openxmlformats.org/wordprocessingml/2006/main" xmlns:w14="http://schemas.microsoft.com/office/word/2010/wordml" xmlns:w15="http://schemas.microsoft.com/office/word/2012/wordml" xmlns:w16cex="http://schemas.microsoft.com/office/word/2018/wordml/cex" xmlns:w16cid="http://schemas.microsoft.com/office/word/2016/wordml/cid" xmlns:w16="http://schemas.microsoft.com/office/word/2018/wordml" xmlns:w16sdtdh="http://schemas.microsoft.com/office/word/2020/wordml/sdtdatahash" xmlns:w16se="http://schemas.microsoft.com/office/word/2015/wordml/symex" xmlns:wpg="http://schemas.microsoft.com/office/word/2010/wordprocessingGroup" xmlns:wpi="http://schemas.microsoft.com/office/word/2010/wordprocessingInk" xmlns:wne="http://schemas.microsoft.com/office/word/2006/wordml" xmlns:wps="http://schemas.microsoft.com/office/word/2010/wordprocessingShape" mc:Ignorable="w14 w15 w16se w16cid w16 w16cex w16sdtdh wp14">
   <w:abstractNum w:abstractNumId="0" w15:restartNumberingAfterBreak="0">
     <w:nsid w:val="16C24F57"/>
@@ -3949,7 +3930,7 @@
 </w:numbering>
 </file>
 
-<file path=./word/settings.xml><?xml version="1.0" encoding="utf-8"?>
+<file path=word\settings.xml><?xml version="1.0" encoding="utf-8"?>
 <w:settings xmlns:mc="http://schemas.openxmlformats.org/markup-compatibility/2006" xmlns:o="urn:schemas-microsoft-com:office:office" xmlns:r="http://schemas.openxmlformats.org/officeDocument/2006/relationships" xmlns:m="http://schemas.openxmlformats.org/officeDocument/2006/math" xmlns:v="urn:schemas-microsoft-com:vml" xmlns:w10="urn:schemas-microsoft-com:office:word" xmlns:w="http://schemas.openxmlformats.org/wordprocessingml/2006/main" xmlns:w14="http://schemas.microsoft.com/office/word/2010/wordml" xmlns:w15="http://schemas.microsoft.com/office/word/2012/wordml" xmlns:w16cex="http://schemas.microsoft.com/office/word/2018/wordml/cex" xmlns:w16cid="http://schemas.microsoft.com/office/word/2016/wordml/cid" xmlns:w16="http://schemas.microsoft.com/office/word/2018/wordml" xmlns:w16sdtdh="http://schemas.microsoft.com/office/word/2020/wordml/sdtdatahash" xmlns:w16se="http://schemas.microsoft.com/office/word/2015/wordml/symex" xmlns:sl="http://schemas.openxmlformats.org/schemaLibrary/2006/main" mc:Ignorable="w14 w15 w16se w16cid w16 w16cex w16sdtdh">
   <w:zoom w:percent="100"/>
   <w:defaultTabStop w:val="720"/>
@@ -4003,7 +3984,7 @@
 </w:settings>
 </file>
 
-<file path=./word/styles.xml><?xml version="1.0" encoding="utf-8"?>
+<file path=word\styles.xml><?xml version="1.0" encoding="utf-8"?>
 <w:styles xmlns:mc="http://schemas.openxmlformats.org/markup-compatibility/2006" xmlns:r="http://schemas.openxmlformats.org/officeDocument/2006/relationships" xmlns:w="http://schemas.openxmlformats.org/wordprocessingml/2006/main" xmlns:w14="http://schemas.microsoft.com/office/word/2010/wordml" xmlns:w15="http://schemas.microsoft.com/office/word/2012/wordml" xmlns:w16cex="http://schemas.microsoft.com/office/word/2018/wordml/cex" xmlns:w16cid="http://schemas.microsoft.com/office/word/2016/wordml/cid" xmlns:w16="http://schemas.microsoft.com/office/word/2018/wordml" xmlns:w16sdtdh="http://schemas.microsoft.com/office/word/2020/wordml/sdtdatahash" xmlns:w16se="http://schemas.microsoft.com/office/word/2015/wordml/symex" mc:Ignorable="w14 w15 w16se w16cid w16 w16cex w16sdtdh">
   <w:docDefaults>
     <w:rPrDefault>
@@ -4520,7 +4501,7 @@
 </w:styles>
 </file>
 
-<file path=./word/theme/theme1.xml><?xml version="1.0" encoding="utf-8"?>
+<file path=word\theme\theme1.xml><?xml version="1.0" encoding="utf-8"?>
 <a:theme xmlns:a="http://schemas.openxmlformats.org/drawingml/2006/main" name="Office Theme">
   <a:themeElements>
     <a:clrScheme name="Office">
@@ -4803,7 +4784,7 @@
 </a:theme>
 </file>
 
-<file path=./word/webSettings.xml><?xml version="1.0" encoding="utf-8"?>
+<file path=word\webSettings.xml><?xml version="1.0" encoding="utf-8"?>
 <w:webSettings xmlns:mc="http://schemas.openxmlformats.org/markup-compatibility/2006" xmlns:r="http://schemas.openxmlformats.org/officeDocument/2006/relationships" xmlns:w="http://schemas.openxmlformats.org/wordprocessingml/2006/main" xmlns:w14="http://schemas.microsoft.com/office/word/2010/wordml" xmlns:w15="http://schemas.microsoft.com/office/word/2012/wordml" xmlns:w16cex="http://schemas.microsoft.com/office/word/2018/wordml/cex" xmlns:w16cid="http://schemas.microsoft.com/office/word/2016/wordml/cid" xmlns:w16="http://schemas.microsoft.com/office/word/2018/wordml" xmlns:w16sdtdh="http://schemas.microsoft.com/office/word/2020/wordml/sdtdatahash" xmlns:w16se="http://schemas.microsoft.com/office/word/2015/wordml/symex" mc:Ignorable="w14 w15 w16se w16cid w16 w16cex w16sdtdh">
   <w:relyOnVML/>
   <w:allowPNG/>

</xml_diff>

<commit_message>
feat: add atestes.docx document to bahia_sem_fome assets
</commit_message>
<xml_diff>
--- a/app/modules/bahia_sem_fome/assets/atestes.docx
+++ b/app/modules/bahia_sem_fome/assets/atestes.docx
@@ -1,71 +1,5 @@
 
-<file path=docProps\app.xml><?xml version="1.0" encoding="utf-8"?>
-<Properties xmlns="http://schemas.openxmlformats.org/officeDocument/2006/extended-properties" xmlns:vt="http://schemas.openxmlformats.org/officeDocument/2006/docPropsVTypes">
-  <Template>Normal</Template>
-  <TotalTime>3</TotalTime>
-  <Pages>1</Pages>
-  <Words>262</Words>
-  <Characters>1421</Characters>
-  <Application>Microsoft Office Word</Application>
-  <DocSecurity>0</DocSecurity>
-  <Lines>11</Lines>
-  <Paragraphs>3</Paragraphs>
-  <ScaleCrop>false</ScaleCrop>
-  <HeadingPairs>
-    <vt:vector size="2" baseType="variant">
-      <vt:variant>
-        <vt:lpstr>Título</vt:lpstr>
-      </vt:variant>
-      <vt:variant>
-        <vt:i4>1</vt:i4>
-      </vt:variant>
-    </vt:vector>
-  </HeadingPairs>
-  <TitlesOfParts>
-    <vt:vector size="1" baseType="lpstr">
-      <vt:lpstr/>
-    </vt:vector>
-  </TitlesOfParts>
-  <Company/>
-  <LinksUpToDate>false</LinksUpToDate>
-  <CharactersWithSpaces>1680</CharactersWithSpaces>
-  <SharedDoc>false</SharedDoc>
-  <HyperlinksChanged>false</HyperlinksChanged>
-  <AppVersion>16.0000</AppVersion>
-</Properties>
-</file>
-
-<file path=docProps\core.xml><?xml version="1.0" encoding="utf-8"?>
-<cp:coreProperties xmlns:cp="http://schemas.openxmlformats.org/package/2006/metadata/core-properties" xmlns:dc="http://purl.org/dc/elements/1.1/" xmlns:dcterms="http://purl.org/dc/terms/" xmlns:dcmitype="http://purl.org/dc/dcmitype/" xmlns:xsi="http://www.w3.org/2001/XMLSchema-instance">
-  <dc:creator>ovidio</dc:creator>
-  <cp:lastModifiedBy>CLIENTE</cp:lastModifiedBy>
-  <cp:revision>6</cp:revision>
-  <dcterms:created xsi:type="dcterms:W3CDTF">2026-07-03T13:55:00Z</dcterms:created>
-  <dcterms:modified xsi:type="dcterms:W3CDTF">2026-07-09T18:27:00Z</dcterms:modified>
-</cp:coreProperties>
-</file>
-
-<file path=docProps\custom.xml><?xml version="1.0" encoding="utf-8"?>
-<Properties xmlns="http://schemas.openxmlformats.org/officeDocument/2006/custom-properties" xmlns:vt="http://schemas.openxmlformats.org/officeDocument/2006/docPropsVTypes">
-  <property fmtid="{D5CDD505-2E9C-101B-9397-08002B2CF9AE}" pid="2" name="Converter">
-    <vt:lpwstr>SolidFramework v10.0.19910.1</vt:lpwstr>
-  </property>
-  <property fmtid="{D5CDD505-2E9C-101B-9397-08002B2CF9AE}" pid="3" name="Created">
-    <vt:filetime>2025-10-10T00:00:00Z</vt:filetime>
-  </property>
-  <property fmtid="{D5CDD505-2E9C-101B-9397-08002B2CF9AE}" pid="4" name="Creator">
-    <vt:lpwstr>Microsoft® Word 2016</vt:lpwstr>
-  </property>
-  <property fmtid="{D5CDD505-2E9C-101B-9397-08002B2CF9AE}" pid="5" name="LastSaved">
-    <vt:filetime>2026-07-03T00:00:00Z</vt:filetime>
-  </property>
-  <property fmtid="{D5CDD505-2E9C-101B-9397-08002B2CF9AE}" pid="6" name="Producer">
-    <vt:lpwstr>www.ilovepdf.com</vt:lpwstr>
-  </property>
-</Properties>
-</file>
-
-<file path=word\document.xml><?xml version="1.0" encoding="utf-8"?>
+<file path=word/document.xml><?xml version="1.0" encoding="utf-8"?>
 <w:document xmlns:wpc="http://schemas.microsoft.com/office/word/2010/wordprocessingCanvas" xmlns:cx="http://schemas.microsoft.com/office/drawing/2014/chartex" xmlns:cx1="http://schemas.microsoft.com/office/drawing/2015/9/8/chartex" xmlns:cx2="http://schemas.microsoft.com/office/drawing/2015/10/21/chartex" xmlns:cx3="http://schemas.microsoft.com/office/drawing/2016/5/9/chartex" xmlns:cx4="http://schemas.microsoft.com/office/drawing/2016/5/10/chartex" xmlns:cx5="http://schemas.microsoft.com/office/drawing/2016/5/11/chartex" xmlns:cx6="http://schemas.microsoft.com/office/drawing/2016/5/12/chartex" xmlns:cx7="http://schemas.microsoft.com/office/drawing/2016/5/13/chartex" xmlns:cx8="http://schemas.microsoft.com/office/drawing/2016/5/14/chartex" xmlns:mc="http://schemas.openxmlformats.org/markup-compatibility/2006" xmlns:aink="http://schemas.microsoft.com/office/drawing/2016/ink" xmlns:am3d="http://schemas.microsoft.com/office/drawing/2017/model3d" xmlns:o="urn:schemas-microsoft-com:office:office" xmlns:r="http://schemas.openxmlformats.org/officeDocument/2006/relationships" xmlns:m="http://schemas.openxmlformats.org/officeDocument/2006/math" xmlns:v="urn:schemas-microsoft-com:vml" xmlns:wp14="http://schemas.microsoft.com/office/word/2010/wordprocessingDrawing" xmlns:wp="http://schemas.openxmlformats.org/drawingml/2006/wordprocessingDrawing" xmlns:w10="urn:schemas-microsoft-com:office:word" xmlns:w="http://schemas.openxmlformats.org/wordprocessingml/2006/main" xmlns:w14="http://schemas.microsoft.com/office/word/2010/wordml" xmlns:w15="http://schemas.microsoft.com/office/word/2012/wordml" xmlns:w16cex="http://schemas.microsoft.com/office/word/2018/wordml/cex" xmlns:w16cid="http://schemas.microsoft.com/office/word/2016/wordml/cid" xmlns:w16="http://schemas.microsoft.com/office/word/2018/wordml" xmlns:w16sdtdh="http://schemas.microsoft.com/office/word/2020/wordml/sdtdatahash" xmlns:w16se="http://schemas.microsoft.com/office/word/2015/wordml/symex" xmlns:wpg="http://schemas.microsoft.com/office/word/2010/wordprocessingGroup" xmlns:wpi="http://schemas.microsoft.com/office/word/2010/wordprocessingInk" xmlns:wne="http://schemas.microsoft.com/office/word/2006/wordml" xmlns:wps="http://schemas.microsoft.com/office/word/2010/wordprocessingShape" mc:Ignorable="w14 w15 w16se w16cid w16 w16cex w16sdtdh wp14">
   <w:body>
     <w:p>
@@ -1349,7 +1283,7 @@
                 <w:sz w:val="20"/>
                 <w:szCs w:val="20"/>
               </w:rPr>
-              <w:t>{{{{cpf_beneficiario}}</w:t>
+              <w:t>{{{{{cpf_beneficiario}}</w:t>
             </w:r>
           </w:p>
         </w:tc>
@@ -3754,54 +3688,7 @@
 </w:document>
 </file>
 
-<file path=word\fontTable.xml><?xml version="1.0" encoding="utf-8"?>
-<w:fonts xmlns:mc="http://schemas.openxmlformats.org/markup-compatibility/2006" xmlns:r="http://schemas.openxmlformats.org/officeDocument/2006/relationships" xmlns:w="http://schemas.openxmlformats.org/wordprocessingml/2006/main" xmlns:w14="http://schemas.microsoft.com/office/word/2010/wordml" xmlns:w15="http://schemas.microsoft.com/office/word/2012/wordml" xmlns:w16cex="http://schemas.microsoft.com/office/word/2018/wordml/cex" xmlns:w16cid="http://schemas.microsoft.com/office/word/2016/wordml/cid" xmlns:w16="http://schemas.microsoft.com/office/word/2018/wordml" xmlns:w16sdtdh="http://schemas.microsoft.com/office/word/2020/wordml/sdtdatahash" xmlns:w16se="http://schemas.microsoft.com/office/word/2015/wordml/symex" mc:Ignorable="w14 w15 w16se w16cid w16 w16cex w16sdtdh">
-  <w:font w:name="Microsoft Sans Serif">
-    <w:altName w:val="Microsoft Sans Serif"/>
-    <w:panose1 w:val="020B0604020202020204"/>
-    <w:charset w:val="00"/>
-    <w:family w:val="swiss"/>
-    <w:pitch w:val="variable"/>
-    <w:sig w:usb0="E5002EFF" w:usb1="C000605B" w:usb2="00000029" w:usb3="00000000" w:csb0="000101FF" w:csb1="00000000"/>
-  </w:font>
-  <w:font w:name="Times New Roman">
-    <w:panose1 w:val="02020603050405020304"/>
-    <w:charset w:val="00"/>
-    <w:family w:val="roman"/>
-    <w:pitch w:val="variable"/>
-    <w:sig w:usb0="E0002EFF" w:usb1="C000785B" w:usb2="00000009" w:usb3="00000000" w:csb0="000001FF" w:csb1="00000000"/>
-  </w:font>
-  <w:font w:name="Calibri">
-    <w:panose1 w:val="020F0502020204030204"/>
-    <w:charset w:val="00"/>
-    <w:family w:val="swiss"/>
-    <w:pitch w:val="variable"/>
-    <w:sig w:usb0="E4002EFF" w:usb1="C000247B" w:usb2="00000009" w:usb3="00000000" w:csb0="000001FF" w:csb1="00000000"/>
-  </w:font>
-  <w:font w:name="Arial">
-    <w:panose1 w:val="020B0604020202020204"/>
-    <w:charset w:val="00"/>
-    <w:family w:val="swiss"/>
-    <w:pitch w:val="variable"/>
-    <w:sig w:usb0="E0002EFF" w:usb1="C000785B" w:usb2="00000009" w:usb3="00000000" w:csb0="000001FF" w:csb1="00000000"/>
-  </w:font>
-  <w:font w:name="Cambria">
-    <w:panose1 w:val="02040503050406030204"/>
-    <w:charset w:val="00"/>
-    <w:family w:val="roman"/>
-    <w:pitch w:val="variable"/>
-    <w:sig w:usb0="E00006FF" w:usb1="420024FF" w:usb2="02000000" w:usb3="00000000" w:csb0="0000019F" w:csb1="00000000"/>
-  </w:font>
-  <w:font w:name="Arial MT">
-    <w:altName w:val="Arial"/>
-    <w:charset w:val="01"/>
-    <w:family w:val="swiss"/>
-    <w:pitch w:val="variable"/>
-  </w:font>
-</w:fonts>
-</file>
-
-<file path=word\numbering.xml><?xml version="1.0" encoding="utf-8"?>
+<file path=word/numbering.xml><?xml version="1.0" encoding="utf-8"?>
 <w:numbering xmlns:wpc="http://schemas.microsoft.com/office/word/2010/wordprocessingCanvas" xmlns:cx="http://schemas.microsoft.com/office/drawing/2014/chartex" xmlns:cx1="http://schemas.microsoft.com/office/drawing/2015/9/8/chartex" xmlns:cx2="http://schemas.microsoft.com/office/drawing/2015/10/21/chartex" xmlns:cx3="http://schemas.microsoft.com/office/drawing/2016/5/9/chartex" xmlns:cx4="http://schemas.microsoft.com/office/drawing/2016/5/10/chartex" xmlns:cx5="http://schemas.microsoft.com/office/drawing/2016/5/11/chartex" xmlns:cx6="http://schemas.microsoft.com/office/drawing/2016/5/12/chartex" xmlns:cx7="http://schemas.microsoft.com/office/drawing/2016/5/13/chartex" xmlns:cx8="http://schemas.microsoft.com/office/drawing/2016/5/14/chartex" xmlns:mc="http://schemas.openxmlformats.org/markup-compatibility/2006" xmlns:aink="http://schemas.microsoft.com/office/drawing/2016/ink" xmlns:am3d="http://schemas.microsoft.com/office/drawing/2017/model3d" xmlns:o="urn:schemas-microsoft-com:office:office" xmlns:r="http://schemas.openxmlformats.org/officeDocument/2006/relationships" xmlns:m="http://schemas.openxmlformats.org/officeDocument/2006/math" xmlns:v="urn:schemas-microsoft-com:vml" xmlns:wp14="http://schemas.microsoft.com/office/word/2010/wordprocessingDrawing" xmlns:wp="http://schemas.openxmlformats.org/drawingml/2006/wordprocessingDrawing" xmlns:w10="urn:schemas-microsoft-com:office:word" xmlns:w="http://schemas.openxmlformats.org/wordprocessingml/2006/main" xmlns:w14="http://schemas.microsoft.com/office/word/2010/wordml" xmlns:w15="http://schemas.microsoft.com/office/word/2012/wordml" xmlns:w16cex="http://schemas.microsoft.com/office/word/2018/wordml/cex" xmlns:w16cid="http://schemas.microsoft.com/office/word/2016/wordml/cid" xmlns:w16="http://schemas.microsoft.com/office/word/2018/wordml" xmlns:w16sdtdh="http://schemas.microsoft.com/office/word/2020/wordml/sdtdatahash" xmlns:w16se="http://schemas.microsoft.com/office/word/2015/wordml/symex" xmlns:wpg="http://schemas.microsoft.com/office/word/2010/wordprocessingGroup" xmlns:wpi="http://schemas.microsoft.com/office/word/2010/wordprocessingInk" xmlns:wne="http://schemas.microsoft.com/office/word/2006/wordml" xmlns:wps="http://schemas.microsoft.com/office/word/2010/wordprocessingShape" mc:Ignorable="w14 w15 w16se w16cid w16 w16cex w16sdtdh wp14">
   <w:abstractNum w:abstractNumId="0" w15:restartNumberingAfterBreak="0">
     <w:nsid w:val="16C24F57"/>
@@ -3930,61 +3817,7 @@
 </w:numbering>
 </file>
 
-<file path=word\settings.xml><?xml version="1.0" encoding="utf-8"?>
-<w:settings xmlns:mc="http://schemas.openxmlformats.org/markup-compatibility/2006" xmlns:o="urn:schemas-microsoft-com:office:office" xmlns:r="http://schemas.openxmlformats.org/officeDocument/2006/relationships" xmlns:m="http://schemas.openxmlformats.org/officeDocument/2006/math" xmlns:v="urn:schemas-microsoft-com:vml" xmlns:w10="urn:schemas-microsoft-com:office:word" xmlns:w="http://schemas.openxmlformats.org/wordprocessingml/2006/main" xmlns:w14="http://schemas.microsoft.com/office/word/2010/wordml" xmlns:w15="http://schemas.microsoft.com/office/word/2012/wordml" xmlns:w16cex="http://schemas.microsoft.com/office/word/2018/wordml/cex" xmlns:w16cid="http://schemas.microsoft.com/office/word/2016/wordml/cid" xmlns:w16="http://schemas.microsoft.com/office/word/2018/wordml" xmlns:w16sdtdh="http://schemas.microsoft.com/office/word/2020/wordml/sdtdatahash" xmlns:w16se="http://schemas.microsoft.com/office/word/2015/wordml/symex" xmlns:sl="http://schemas.openxmlformats.org/schemaLibrary/2006/main" mc:Ignorable="w14 w15 w16se w16cid w16 w16cex w16sdtdh">
-  <w:zoom w:percent="100"/>
-  <w:defaultTabStop w:val="720"/>
-  <w:hyphenationZone w:val="425"/>
-  <w:drawingGridHorizontalSpacing w:val="110"/>
-  <w:displayHorizontalDrawingGridEvery w:val="2"/>
-  <w:characterSpacingControl w:val="doNotCompress"/>
-  <w:compat>
-    <w:ulTrailSpace/>
-    <w:compatSetting w:name="compatibilityMode" w:uri="http://schemas.microsoft.com/office/word" w:val="15"/>
-    <w:compatSetting w:name="overrideTableStyleFontSizeAndJustification" w:uri="http://schemas.microsoft.com/office/word" w:val="1"/>
-    <w:compatSetting w:name="enableOpenTypeFeatures" w:uri="http://schemas.microsoft.com/office/word" w:val="1"/>
-    <w:compatSetting w:name="doNotFlipMirrorIndents" w:uri="http://schemas.microsoft.com/office/word" w:val="1"/>
-    <w:compatSetting w:name="differentiateMultirowTableHeaders" w:uri="http://schemas.microsoft.com/office/word" w:val="1"/>
-    <w:compatSetting w:name="useWord2013TrackBottomHyphenation" w:uri="http://schemas.microsoft.com/office/word" w:val="1"/>
-  </w:compat>
-  <w:rsids>
-    <w:rsidRoot w:val="00A43B55"/>
-    <w:rsid w:val="00002621"/>
-    <w:rsid w:val="00042A63"/>
-    <w:rsid w:val="00116E4E"/>
-    <w:rsid w:val="00423387"/>
-    <w:rsid w:val="007106D5"/>
-    <w:rsid w:val="00A43B55"/>
-  </w:rsids>
-  <m:mathPr>
-    <m:mathFont m:val="Cambria Math"/>
-    <m:brkBin m:val="before"/>
-    <m:brkBinSub m:val="--"/>
-    <m:smallFrac m:val="0"/>
-    <m:dispDef/>
-    <m:lMargin m:val="0"/>
-    <m:rMargin m:val="0"/>
-    <m:defJc m:val="centerGroup"/>
-    <m:wrapIndent m:val="1440"/>
-    <m:intLim m:val="subSup"/>
-    <m:naryLim m:val="undOvr"/>
-  </m:mathPr>
-  <w:themeFontLang w:val="pt-BR"/>
-  <w:clrSchemeMapping w:bg1="light1" w:t1="dark1" w:bg2="light2" w:t2="dark2" w:accent1="accent1" w:accent2="accent2" w:accent3="accent3" w:accent4="accent4" w:accent5="accent5" w:accent6="accent6" w:hyperlink="hyperlink" w:followedHyperlink="followedHyperlink"/>
-  <w:shapeDefaults>
-    <o:shapedefaults v:ext="edit" spidmax="1026"/>
-    <o:shapelayout v:ext="edit">
-      <o:idmap v:ext="edit" data="1"/>
-    </o:shapelayout>
-  </w:shapeDefaults>
-  <w:decimalSymbol w:val=","/>
-  <w:listSeparator w:val=";"/>
-  <w14:docId w14:val="378FBBD7"/>
-  <w15:docId w15:val="{12E7A569-A41C-426B-89AD-0512E735AEEE}"/>
-</w:settings>
-</file>
-
-<file path=word\styles.xml><?xml version="1.0" encoding="utf-8"?>
+<file path=word/styles.xml><?xml version="1.0" encoding="utf-8"?>
 <w:styles xmlns:mc="http://schemas.openxmlformats.org/markup-compatibility/2006" xmlns:r="http://schemas.openxmlformats.org/officeDocument/2006/relationships" xmlns:w="http://schemas.openxmlformats.org/wordprocessingml/2006/main" xmlns:w14="http://schemas.microsoft.com/office/word/2010/wordml" xmlns:w15="http://schemas.microsoft.com/office/word/2012/wordml" xmlns:w16cex="http://schemas.microsoft.com/office/word/2018/wordml/cex" xmlns:w16cid="http://schemas.microsoft.com/office/word/2016/wordml/cid" xmlns:w16="http://schemas.microsoft.com/office/word/2018/wordml" xmlns:w16sdtdh="http://schemas.microsoft.com/office/word/2020/wordml/sdtdatahash" xmlns:w16se="http://schemas.microsoft.com/office/word/2015/wordml/symex" mc:Ignorable="w14 w15 w16se w16cid w16 w16cex w16sdtdh">
   <w:docDefaults>
     <w:rPrDefault>
@@ -4501,7 +4334,7 @@
 </w:styles>
 </file>
 
-<file path=word\theme\theme1.xml><?xml version="1.0" encoding="utf-8"?>
+<file path=word/theme/theme1.xml><?xml version="1.0" encoding="utf-8"?>
 <a:theme xmlns:a="http://schemas.openxmlformats.org/drawingml/2006/main" name="Office Theme">
   <a:themeElements>
     <a:clrScheme name="Office">
@@ -4782,11 +4615,4 @@
   <a:objectDefaults/>
   <a:extraClrSchemeLst/>
 </a:theme>
-</file>
-
-<file path=word\webSettings.xml><?xml version="1.0" encoding="utf-8"?>
-<w:webSettings xmlns:mc="http://schemas.openxmlformats.org/markup-compatibility/2006" xmlns:r="http://schemas.openxmlformats.org/officeDocument/2006/relationships" xmlns:w="http://schemas.openxmlformats.org/wordprocessingml/2006/main" xmlns:w14="http://schemas.microsoft.com/office/word/2010/wordml" xmlns:w15="http://schemas.microsoft.com/office/word/2012/wordml" xmlns:w16cex="http://schemas.microsoft.com/office/word/2018/wordml/cex" xmlns:w16cid="http://schemas.microsoft.com/office/word/2016/wordml/cid" xmlns:w16="http://schemas.microsoft.com/office/word/2018/wordml" xmlns:w16sdtdh="http://schemas.microsoft.com/office/word/2020/wordml/sdtdatahash" xmlns:w16se="http://schemas.microsoft.com/office/word/2015/wordml/symex" mc:Ignorable="w14 w15 w16se w16cid w16 w16cex w16sdtdh">
-  <w:relyOnVML/>
-  <w:allowPNG/>
-</w:webSettings>
 </file>
</xml_diff>

<commit_message>
feat: add atestes.docx document to bahia_sem_fome module assets
</commit_message>
<xml_diff>
--- a/app/modules/bahia_sem_fome/assets/atestes.docx
+++ b/app/modules/bahia_sem_fome/assets/atestes.docx
@@ -1,6 +1,6 @@
 
 <file path=word/document.xml><?xml version="1.0" encoding="utf-8"?>
-<w:document xmlns:wpc="http://schemas.microsoft.com/office/word/2010/wordprocessingCanvas" xmlns:cx="http://schemas.microsoft.com/office/drawing/2014/chartex" xmlns:cx1="http://schemas.microsoft.com/office/drawing/2015/9/8/chartex" xmlns:cx2="http://schemas.microsoft.com/office/drawing/2015/10/21/chartex" xmlns:cx3="http://schemas.microsoft.com/office/drawing/2016/5/9/chartex" xmlns:cx4="http://schemas.microsoft.com/office/drawing/2016/5/10/chartex" xmlns:cx5="http://schemas.microsoft.com/office/drawing/2016/5/11/chartex" xmlns:cx6="http://schemas.microsoft.com/office/drawing/2016/5/12/chartex" xmlns:cx7="http://schemas.microsoft.com/office/drawing/2016/5/13/chartex" xmlns:cx8="http://schemas.microsoft.com/office/drawing/2016/5/14/chartex" xmlns:mc="http://schemas.openxmlformats.org/markup-compatibility/2006" xmlns:aink="http://schemas.microsoft.com/office/drawing/2016/ink" xmlns:am3d="http://schemas.microsoft.com/office/drawing/2017/model3d" xmlns:o="urn:schemas-microsoft-com:office:office" xmlns:r="http://schemas.openxmlformats.org/officeDocument/2006/relationships" xmlns:m="http://schemas.openxmlformats.org/officeDocument/2006/math" xmlns:v="urn:schemas-microsoft-com:vml" xmlns:wp14="http://schemas.microsoft.com/office/word/2010/wordprocessingDrawing" xmlns:wp="http://schemas.openxmlformats.org/drawingml/2006/wordprocessingDrawing" xmlns:w10="urn:schemas-microsoft-com:office:word" xmlns:w="http://schemas.openxmlformats.org/wordprocessingml/2006/main" xmlns:w14="http://schemas.microsoft.com/office/word/2010/wordml" xmlns:w15="http://schemas.microsoft.com/office/word/2012/wordml" xmlns:w16cex="http://schemas.microsoft.com/office/word/2018/wordml/cex" xmlns:w16cid="http://schemas.microsoft.com/office/word/2016/wordml/cid" xmlns:w16="http://schemas.microsoft.com/office/word/2018/wordml" xmlns:w16sdtdh="http://schemas.microsoft.com/office/word/2020/wordml/sdtdatahash" xmlns:w16se="http://schemas.microsoft.com/office/word/2015/wordml/symex" xmlns:wpg="http://schemas.microsoft.com/office/word/2010/wordprocessingGroup" xmlns:wpi="http://schemas.microsoft.com/office/word/2010/wordprocessingInk" xmlns:wne="http://schemas.microsoft.com/office/word/2006/wordml" xmlns:wps="http://schemas.microsoft.com/office/word/2010/wordprocessingShape" mc:Ignorable="w14 w15 w16se w16cid w16 w16cex w16sdtdh wp14">
+<w:document xmlns:wpc="http://schemas.microsoft.com/office/word/2010/wordprocessingCanvas" xmlns:cx="http://schemas.microsoft.com/office/drawing/2014/chartex" xmlns:cx1="http://schemas.microsoft.com/office/drawing/2015/9/8/chartex" xmlns:cx2="http://schemas.microsoft.com/office/drawing/2015/10/21/chartex" xmlns:cx3="http://schemas.microsoft.com/office/drawing/2016/5/9/chartex" xmlns:cx4="http://schemas.microsoft.com/office/drawing/2016/5/10/chartex" xmlns:cx5="http://schemas.microsoft.com/office/drawing/2016/5/11/chartex" xmlns:cx6="http://schemas.microsoft.com/office/drawing/2016/5/12/chartex" xmlns:cx7="http://schemas.microsoft.com/office/drawing/2016/5/13/chartex" xmlns:cx8="http://schemas.microsoft.com/office/drawing/2016/5/14/chartex" xmlns:mc="http://schemas.openxmlformats.org/markup-compatibility/2006" xmlns:aink="http://schemas.microsoft.com/office/drawing/2016/ink" xmlns:am3d="http://schemas.microsoft.com/office/drawing/2017/model3d" xmlns:o="urn:schemas-microsoft-com:office:office" xmlns:oel="http://schemas.microsoft.com/office/2019/extlst" xmlns:r="http://schemas.openxmlformats.org/officeDocument/2006/relationships" xmlns:m="http://schemas.openxmlformats.org/officeDocument/2006/math" xmlns:v="urn:schemas-microsoft-com:vml" xmlns:wp14="http://schemas.microsoft.com/office/word/2010/wordprocessingDrawing" xmlns:wp="http://schemas.openxmlformats.org/drawingml/2006/wordprocessingDrawing" xmlns:w10="urn:schemas-microsoft-com:office:word" xmlns:w="http://schemas.openxmlformats.org/wordprocessingml/2006/main" xmlns:w14="http://schemas.microsoft.com/office/word/2010/wordml" xmlns:w15="http://schemas.microsoft.com/office/word/2012/wordml" xmlns:w16cex="http://schemas.microsoft.com/office/word/2018/wordml/cex" xmlns:w16cid="http://schemas.microsoft.com/office/word/2016/wordml/cid" xmlns:w16="http://schemas.microsoft.com/office/word/2018/wordml" xmlns:w16du="http://schemas.microsoft.com/office/word/2023/wordml/word16du" xmlns:w16sdtdh="http://schemas.microsoft.com/office/word/2020/wordml/sdtdatahash" xmlns:w16sdtfl="http://schemas.microsoft.com/office/word/2024/wordml/sdtformatlock" xmlns:w16se="http://schemas.microsoft.com/office/word/2015/wordml/symex" xmlns:wpg="http://schemas.microsoft.com/office/word/2010/wordprocessingGroup" xmlns:wpi="http://schemas.microsoft.com/office/word/2010/wordprocessingInk" xmlns:wne="http://schemas.microsoft.com/office/word/2006/wordml" xmlns:wps="http://schemas.microsoft.com/office/word/2010/wordprocessingShape" mc:Ignorable="w14 w15 w16se w16cid w16 w16cex w16sdtdh w16sdtfl w16du wp14">
   <w:body>
     <w:p>
       <w:pPr>
@@ -405,11 +405,12 @@
           </mc:Choice>
           <mc:Fallback>
             <w:pict>
-              <v:shapetype w14:anchorId="4A7C2EAC" id="_x0000_t202" coordsize="21600,21600" o:spt="202" path="m,l,21600r21600,l21600,xe">
+              <v:shapetype id="_x0000_t202" coordsize="21600,21600" o:spt="202" path="m,l,21600r21600,l21600,xe">
                 <v:stroke joinstyle="miter"/>
                 <v:path gradientshapeok="t" o:connecttype="rect"/>
               </v:shapetype>
-              <v:shape id="Textbox 5" o:spid="_x0000_s1026" type="#_x0000_t202" style="position:absolute;margin-left:20.4pt;margin-top:19.35pt;width:548.2pt;height:25.25pt;z-index:-15728640;visibility:visible;mso-wrap-style:square;mso-wrap-distance-left:0;mso-wrap-distance-top:0;mso-wrap-distance-right:0;mso-wrap-distance-bottom:0;mso-position-horizontal:absolute;mso-position-horizontal-relative:page;mso-position-vertical:absolute;mso-position-vertical-relative:text;v-text-anchor:top" o:gfxdata="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" fillcolor="#dbe4f0" stroked="f">
+              <v:shape id="Textbox 5" o:spid="_x0000_s1026" type="#_x0000_t202" style="position:absolute;margin-left:20.4pt;margin-top:19.35pt;width:548.2pt;height:25.25pt;z-index:-15728640;visibility:visible;mso-wrap-style:square;mso-wrap-distance-left:0;mso-wrap-distance-top:0;mso-wrap-distance-right:0;mso-wrap-distance-bottom:0;mso-position-horizontal:absolute;mso-position-horizontal-relative:page;mso-position-vertical:absolute;mso-position-vertical-relative:text;v-text-anchor:top" o:gfxdata="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" fillcolor="#dbe4f0" stroked="f">
+                <v:path arrowok="t"/>
                 <v:textbox inset="0,0,0,0">
                   <w:txbxContent>
                     <w:p>
@@ -1101,7 +1102,14 @@
                 <w:rFonts w:ascii="Arial" w:hAnsi="Arial" w:cs="Arial"/>
                 <w:color w:val="000000" w:themeColor="text1"/>
               </w:rPr>
-              <w:t xml:space="preserve"> {{</w:t>
+              <w:t xml:space="preserve"> </w:t>
+            </w:r>
+            <w:r>
+              <w:rPr>
+                <w:rFonts w:ascii="Arial" w:hAnsi="Arial" w:cs="Arial"/>
+                <w:color w:val="000000" w:themeColor="text1"/>
+              </w:rPr>
+              <w:t>{{</w:t>
             </w:r>
             <w:r>
               <w:rPr>
@@ -1274,16 +1282,7 @@
                 <w:sz w:val="20"/>
                 <w:szCs w:val="20"/>
               </w:rPr>
-              <w:t>{</w:t>
-            </w:r>
-            <w:r>
-              <w:rPr>
-                <w:rFonts w:ascii="Arial" w:hAnsi="Arial" w:cs="Arial"/>
-                <w:b/>
-                <w:sz w:val="20"/>
-                <w:szCs w:val="20"/>
-              </w:rPr>
-              <w:t>{{{{{cpf_beneficiario}}</w:t>
+              <w:t>{{cpf_beneficiario}}</w:t>
             </w:r>
           </w:p>
         </w:tc>
@@ -2793,7 +2792,7 @@
               </wp:anchor>
             </w:drawing>
           </mc:Choice>
-          <mc:Fallback xmlns:w16sdtfl="http://schemas.microsoft.com/office/word/2024/wordml/sdtformatlock" xmlns:w16du="http://schemas.microsoft.com/office/word/2023/wordml/word16du" xmlns:oel="http://schemas.microsoft.com/office/2019/extlst">
+          <mc:Fallback>
             <w:pict>
               <v:shape w14:anchorId="56F419D0" id="Graphic 6" o:spid="_x0000_s1026" style="position:absolute;margin-left:35.75pt;margin-top:20.7pt;width:236.85pt;height:1.45pt;z-index:-15728128;visibility:visible;mso-wrap-style:square;mso-wrap-distance-left:0;mso-wrap-distance-top:0;mso-wrap-distance-right:0;mso-wrap-distance-bottom:0;mso-position-horizontal:absolute;mso-position-horizontal-relative:page;mso-position-vertical:absolute;mso-position-vertical-relative:text;v-text-anchor:top" coordsize="3007995,18415" o:gfxdata="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" path="m3007487,l,,,18287r3007487,l3007487,xe" fillcolor="black" stroked="f">
                 <v:path arrowok="t"/>
@@ -2883,7 +2882,7 @@
               </wp:anchor>
             </w:drawing>
           </mc:Choice>
-          <mc:Fallback xmlns:w16sdtfl="http://schemas.microsoft.com/office/word/2024/wordml/sdtformatlock" xmlns:w16du="http://schemas.microsoft.com/office/word/2023/wordml/word16du" xmlns:oel="http://schemas.microsoft.com/office/2019/extlst">
+          <mc:Fallback>
             <w:pict>
               <v:shape w14:anchorId="02307D5E" id="Graphic 7" o:spid="_x0000_s1026" style="position:absolute;margin-left:309.55pt;margin-top:21.45pt;width:249.55pt;height:1.45pt;z-index:-15727616;visibility:visible;mso-wrap-style:square;mso-wrap-distance-left:0;mso-wrap-distance-top:0;mso-wrap-distance-right:0;mso-wrap-distance-bottom:0;mso-position-horizontal:absolute;mso-position-horizontal-relative:page;mso-position-vertical:absolute;mso-position-vertical-relative:text;v-text-anchor:top" coordsize="3169285,18415" o:gfxdata="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" path="m3169030,l,,,18287r3169030,l3169030,xe" fillcolor="black" stroked="f">
                 <v:path arrowok="t"/>
@@ -3054,7 +3053,7 @@
               </wp:anchor>
             </w:drawing>
           </mc:Choice>
-          <mc:Fallback xmlns:w16sdtfl="http://schemas.microsoft.com/office/word/2024/wordml/sdtformatlock" xmlns:w16du="http://schemas.microsoft.com/office/word/2023/wordml/word16du" xmlns:oel="http://schemas.microsoft.com/office/2019/extlst">
+          <mc:Fallback>
             <w:pict>
               <v:shape w14:anchorId="75B15D67" id="Graphic 8" o:spid="_x0000_s1026" style="position:absolute;margin-left:177.5pt;margin-top:12.55pt;width:373.3pt;height:1.45pt;z-index:-15727104;visibility:visible;mso-wrap-style:square;mso-wrap-distance-left:0;mso-wrap-distance-top:0;mso-wrap-distance-right:0;mso-wrap-distance-bottom:0;mso-position-horizontal:absolute;mso-position-horizontal-relative:page;mso-position-vertical:absolute;mso-position-vertical-relative:text;v-text-anchor:top" coordsize="4740910,18415" o:gfxdata="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" path="m4740529,l,,,18287r4740529,l4740529,xe" fillcolor="black" stroked="f">
                 <v:path arrowok="t"/>
@@ -3147,7 +3146,7 @@
               </wp:anchor>
             </w:drawing>
           </mc:Choice>
-          <mc:Fallback xmlns:w16sdtfl="http://schemas.microsoft.com/office/word/2024/wordml/sdtformatlock" xmlns:w16du="http://schemas.microsoft.com/office/word/2023/wordml/word16du" xmlns:oel="http://schemas.microsoft.com/office/2019/extlst">
+          <mc:Fallback>
             <w:pict>
               <v:shape w14:anchorId="25EA92C4" id="Graphic 9" o:spid="_x0000_s1026" style="position:absolute;margin-left:57.75pt;margin-top:-5.45pt;width:96pt;height:110.25pt;z-index:15731712;visibility:visible;mso-wrap-style:square;mso-wrap-distance-left:0;mso-wrap-distance-top:0;mso-wrap-distance-right:0;mso-wrap-distance-bottom:0;mso-position-horizontal:absolute;mso-position-horizontal-relative:page;mso-position-vertical:absolute;mso-position-vertical-relative:text;v-text-anchor:top" coordsize="1219200,1400175" o:gfxdata="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" path="m,1400175r1219200,l1219200,,,,,1400175xe" filled="f">
                 <v:path arrowok="t"/>
@@ -3316,7 +3315,7 @@
               </wp:anchor>
             </w:drawing>
           </mc:Choice>
-          <mc:Fallback xmlns:w16sdtfl="http://schemas.microsoft.com/office/word/2024/wordml/sdtformatlock" xmlns:w16du="http://schemas.microsoft.com/office/word/2023/wordml/word16du" xmlns:oel="http://schemas.microsoft.com/office/2019/extlst">
+          <mc:Fallback>
             <w:pict>
               <v:shape w14:anchorId="03D5B984" id="Graphic 10" o:spid="_x0000_s1026" style="position:absolute;margin-left:205.95pt;margin-top:18.1pt;width:301.25pt;height:1.45pt;z-index:-15726592;visibility:visible;mso-wrap-style:square;mso-wrap-distance-left:0;mso-wrap-distance-top:0;mso-wrap-distance-right:0;mso-wrap-distance-bottom:0;mso-position-horizontal:absolute;mso-position-horizontal-relative:page;mso-position-vertical:absolute;mso-position-vertical-relative:text;v-text-anchor:top" coordsize="3825875,18415" o:gfxdata="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" path="m3825875,l,,,18287r3825875,l3825875,xe" fillcolor="black" stroked="f">
                 <v:path arrowok="t"/>
@@ -3536,7 +3535,7 @@
               </wp:anchor>
             </w:drawing>
           </mc:Choice>
-          <mc:Fallback xmlns:w16sdtfl="http://schemas.microsoft.com/office/word/2024/wordml/sdtformatlock" xmlns:w16du="http://schemas.microsoft.com/office/word/2023/wordml/word16du" xmlns:oel="http://schemas.microsoft.com/office/2019/extlst">
+          <mc:Fallback>
             <w:pict>
               <v:shape w14:anchorId="1BE2CA1D" id="Graphic 11" o:spid="_x0000_s1026" style="position:absolute;margin-left:92.2pt;margin-top:19pt;width:409.85pt;height:.1pt;z-index:-15726080;visibility:visible;mso-wrap-style:square;mso-wrap-distance-left:0;mso-wrap-distance-top:0;mso-wrap-distance-right:0;mso-wrap-distance-bottom:0;mso-position-horizontal:absolute;mso-position-horizontal-relative:page;mso-position-vertical:absolute;mso-position-vertical-relative:text;v-text-anchor:top" coordsize="5205095,1270" o:gfxdata="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" path="m,l5205095,e" filled="f">
                 <v:path arrowok="t"/>
@@ -3625,7 +3624,6 @@
         <w:rPr>
           <w:rFonts w:ascii="Microsoft Sans Serif" w:hAnsi="Microsoft Sans Serif"/>
           <w:sz w:val="18"/>
-          <w:lang w:val="en-US"/>
         </w:rPr>
       </w:pPr>
       <w:r>
@@ -3633,15 +3631,7 @@
           <w:rFonts w:ascii="Microsoft Sans Serif" w:hAnsi="Microsoft Sans Serif"/>
           <w:sz w:val="18"/>
         </w:rPr>
-        <w:t xml:space="preserve">Avenida Dorival Caymmi, 15.649 – Salvador/BA. </w:t>
-      </w:r>
-      <w:r>
-        <w:rPr>
-          <w:rFonts w:ascii="Microsoft Sans Serif" w:hAnsi="Microsoft Sans Serif"/>
-          <w:sz w:val="18"/>
-          <w:lang w:val="en-US"/>
-        </w:rPr>
-        <w:t xml:space="preserve">CEP: 41.635-150 </w:t>
+        <w:t xml:space="preserve">Avenida Dorival Caymmi, 15.649 – Salvador/BA. CEP: 41.635-150 </w:t>
       </w:r>
       <w:hyperlink r:id="rId7">
         <w:r>
@@ -3650,7 +3640,6 @@
             <w:spacing w:val="-2"/>
             <w:w w:val="105"/>
             <w:sz w:val="18"/>
-            <w:lang w:val="en-US"/>
           </w:rPr>
           <w:t>www.sdr.ba.gov.br</w:t>
         </w:r>
@@ -3661,7 +3650,6 @@
           <w:spacing w:val="-2"/>
           <w:w w:val="105"/>
           <w:sz w:val="18"/>
-          <w:lang w:val="en-US"/>
         </w:rPr>
         <w:t xml:space="preserve"> | </w:t>
       </w:r>
@@ -3672,7 +3660,6 @@
             <w:spacing w:val="-2"/>
             <w:w w:val="105"/>
             <w:sz w:val="18"/>
-            <w:lang w:val="en-US"/>
           </w:rPr>
           <w:t>www.bahiater.sdr.ba.gov.br</w:t>
         </w:r>
@@ -3689,7 +3676,7 @@
 </file>
 
 <file path=word/numbering.xml><?xml version="1.0" encoding="utf-8"?>
-<w:numbering xmlns:wpc="http://schemas.microsoft.com/office/word/2010/wordprocessingCanvas" xmlns:cx="http://schemas.microsoft.com/office/drawing/2014/chartex" xmlns:cx1="http://schemas.microsoft.com/office/drawing/2015/9/8/chartex" xmlns:cx2="http://schemas.microsoft.com/office/drawing/2015/10/21/chartex" xmlns:cx3="http://schemas.microsoft.com/office/drawing/2016/5/9/chartex" xmlns:cx4="http://schemas.microsoft.com/office/drawing/2016/5/10/chartex" xmlns:cx5="http://schemas.microsoft.com/office/drawing/2016/5/11/chartex" xmlns:cx6="http://schemas.microsoft.com/office/drawing/2016/5/12/chartex" xmlns:cx7="http://schemas.microsoft.com/office/drawing/2016/5/13/chartex" xmlns:cx8="http://schemas.microsoft.com/office/drawing/2016/5/14/chartex" xmlns:mc="http://schemas.openxmlformats.org/markup-compatibility/2006" xmlns:aink="http://schemas.microsoft.com/office/drawing/2016/ink" xmlns:am3d="http://schemas.microsoft.com/office/drawing/2017/model3d" xmlns:o="urn:schemas-microsoft-com:office:office" xmlns:r="http://schemas.openxmlformats.org/officeDocument/2006/relationships" xmlns:m="http://schemas.openxmlformats.org/officeDocument/2006/math" xmlns:v="urn:schemas-microsoft-com:vml" xmlns:wp14="http://schemas.microsoft.com/office/word/2010/wordprocessingDrawing" xmlns:wp="http://schemas.openxmlformats.org/drawingml/2006/wordprocessingDrawing" xmlns:w10="urn:schemas-microsoft-com:office:word" xmlns:w="http://schemas.openxmlformats.org/wordprocessingml/2006/main" xmlns:w14="http://schemas.microsoft.com/office/word/2010/wordml" xmlns:w15="http://schemas.microsoft.com/office/word/2012/wordml" xmlns:w16cex="http://schemas.microsoft.com/office/word/2018/wordml/cex" xmlns:w16cid="http://schemas.microsoft.com/office/word/2016/wordml/cid" xmlns:w16="http://schemas.microsoft.com/office/word/2018/wordml" xmlns:w16sdtdh="http://schemas.microsoft.com/office/word/2020/wordml/sdtdatahash" xmlns:w16se="http://schemas.microsoft.com/office/word/2015/wordml/symex" xmlns:wpg="http://schemas.microsoft.com/office/word/2010/wordprocessingGroup" xmlns:wpi="http://schemas.microsoft.com/office/word/2010/wordprocessingInk" xmlns:wne="http://schemas.microsoft.com/office/word/2006/wordml" xmlns:wps="http://schemas.microsoft.com/office/word/2010/wordprocessingShape" mc:Ignorable="w14 w15 w16se w16cid w16 w16cex w16sdtdh wp14">
+<w:numbering xmlns:wpc="http://schemas.microsoft.com/office/word/2010/wordprocessingCanvas" xmlns:cx="http://schemas.microsoft.com/office/drawing/2014/chartex" xmlns:cx1="http://schemas.microsoft.com/office/drawing/2015/9/8/chartex" xmlns:cx2="http://schemas.microsoft.com/office/drawing/2015/10/21/chartex" xmlns:cx3="http://schemas.microsoft.com/office/drawing/2016/5/9/chartex" xmlns:cx4="http://schemas.microsoft.com/office/drawing/2016/5/10/chartex" xmlns:cx5="http://schemas.microsoft.com/office/drawing/2016/5/11/chartex" xmlns:cx6="http://schemas.microsoft.com/office/drawing/2016/5/12/chartex" xmlns:cx7="http://schemas.microsoft.com/office/drawing/2016/5/13/chartex" xmlns:cx8="http://schemas.microsoft.com/office/drawing/2016/5/14/chartex" xmlns:mc="http://schemas.openxmlformats.org/markup-compatibility/2006" xmlns:aink="http://schemas.microsoft.com/office/drawing/2016/ink" xmlns:am3d="http://schemas.microsoft.com/office/drawing/2017/model3d" xmlns:o="urn:schemas-microsoft-com:office:office" xmlns:oel="http://schemas.microsoft.com/office/2019/extlst" xmlns:r="http://schemas.openxmlformats.org/officeDocument/2006/relationships" xmlns:m="http://schemas.openxmlformats.org/officeDocument/2006/math" xmlns:v="urn:schemas-microsoft-com:vml" xmlns:wp14="http://schemas.microsoft.com/office/word/2010/wordprocessingDrawing" xmlns:wp="http://schemas.openxmlformats.org/drawingml/2006/wordprocessingDrawing" xmlns:w10="urn:schemas-microsoft-com:office:word" xmlns:w="http://schemas.openxmlformats.org/wordprocessingml/2006/main" xmlns:w14="http://schemas.microsoft.com/office/word/2010/wordml" xmlns:w15="http://schemas.microsoft.com/office/word/2012/wordml" xmlns:w16cex="http://schemas.microsoft.com/office/word/2018/wordml/cex" xmlns:w16cid="http://schemas.microsoft.com/office/word/2016/wordml/cid" xmlns:w16="http://schemas.microsoft.com/office/word/2018/wordml" xmlns:w16du="http://schemas.microsoft.com/office/word/2023/wordml/word16du" xmlns:w16sdtdh="http://schemas.microsoft.com/office/word/2020/wordml/sdtdatahash" xmlns:w16sdtfl="http://schemas.microsoft.com/office/word/2024/wordml/sdtformatlock" xmlns:w16se="http://schemas.microsoft.com/office/word/2015/wordml/symex" xmlns:wpg="http://schemas.microsoft.com/office/word/2010/wordprocessingGroup" xmlns:wpi="http://schemas.microsoft.com/office/word/2010/wordprocessingInk" xmlns:wne="http://schemas.microsoft.com/office/word/2006/wordml" xmlns:wps="http://schemas.microsoft.com/office/word/2010/wordprocessingShape" mc:Ignorable="w14 w15 w16se w16cid w16 w16cex w16sdtdh w16sdtfl w16du wp14">
   <w:abstractNum w:abstractNumId="0" w15:restartNumberingAfterBreak="0">
     <w:nsid w:val="16C24F57"/>
     <w:multiLevelType w:val="hybridMultilevel"/>
@@ -3811,14 +3798,14 @@
       </w:rPr>
     </w:lvl>
   </w:abstractNum>
-  <w:num w:numId="1">
+  <w:num w:numId="1" w16cid:durableId="116261863">
     <w:abstractNumId w:val="0"/>
   </w:num>
 </w:numbering>
 </file>
 
 <file path=word/styles.xml><?xml version="1.0" encoding="utf-8"?>
-<w:styles xmlns:mc="http://schemas.openxmlformats.org/markup-compatibility/2006" xmlns:r="http://schemas.openxmlformats.org/officeDocument/2006/relationships" xmlns:w="http://schemas.openxmlformats.org/wordprocessingml/2006/main" xmlns:w14="http://schemas.microsoft.com/office/word/2010/wordml" xmlns:w15="http://schemas.microsoft.com/office/word/2012/wordml" xmlns:w16cex="http://schemas.microsoft.com/office/word/2018/wordml/cex" xmlns:w16cid="http://schemas.microsoft.com/office/word/2016/wordml/cid" xmlns:w16="http://schemas.microsoft.com/office/word/2018/wordml" xmlns:w16sdtdh="http://schemas.microsoft.com/office/word/2020/wordml/sdtdatahash" xmlns:w16se="http://schemas.microsoft.com/office/word/2015/wordml/symex" mc:Ignorable="w14 w15 w16se w16cid w16 w16cex w16sdtdh">
+<w:styles xmlns:mc="http://schemas.openxmlformats.org/markup-compatibility/2006" xmlns:r="http://schemas.openxmlformats.org/officeDocument/2006/relationships" xmlns:w="http://schemas.openxmlformats.org/wordprocessingml/2006/main" xmlns:w14="http://schemas.microsoft.com/office/word/2010/wordml" xmlns:w15="http://schemas.microsoft.com/office/word/2012/wordml" xmlns:w16cex="http://schemas.microsoft.com/office/word/2018/wordml/cex" xmlns:w16cid="http://schemas.microsoft.com/office/word/2016/wordml/cid" xmlns:w16="http://schemas.microsoft.com/office/word/2018/wordml" xmlns:w16du="http://schemas.microsoft.com/office/word/2023/wordml/word16du" xmlns:w16sdtdh="http://schemas.microsoft.com/office/word/2020/wordml/sdtdatahash" xmlns:w16sdtfl="http://schemas.microsoft.com/office/word/2024/wordml/sdtformatlock" xmlns:w16se="http://schemas.microsoft.com/office/word/2015/wordml/symex" mc:Ignorable="w14 w15 w16se w16cid w16 w16cex w16sdtdh w16sdtfl w16du">
   <w:docDefaults>
     <w:rPrDefault>
       <w:rPr>

</xml_diff>

<commit_message>
feat: add atestes.docx and temporary file to bahia_sem_fome assets
</commit_message>
<xml_diff>
--- a/app/modules/bahia_sem_fome/assets/atestes.docx
+++ b/app/modules/bahia_sem_fome/assets/atestes.docx
@@ -207,17 +207,6 @@
           <w:sz w:val="20"/>
         </w:rPr>
       </w:pPr>
-    </w:p>
-    <w:p>
-      <w:pPr>
-        <w:pStyle w:val="Corpodetexto"/>
-        <w:spacing w:before="133"/>
-        <w:rPr>
-          <w:rFonts w:ascii="Times New Roman"/>
-          <w:b w:val="0"/>
-          <w:sz w:val="20"/>
-        </w:rPr>
-      </w:pPr>
       <w:r>
         <w:rPr>
           <w:rFonts w:ascii="Times New Roman"/>
@@ -229,16 +218,16 @@
         <mc:AlternateContent>
           <mc:Choice Requires="wps">
             <w:drawing>
-              <wp:anchor distT="0" distB="0" distL="0" distR="0" simplePos="0" relativeHeight="487587840" behindDoc="1" locked="0" layoutInCell="1" allowOverlap="1" wp14:anchorId="4A7C2EAC" wp14:editId="19175C52">
+              <wp:anchor distT="0" distB="0" distL="0" distR="0" simplePos="0" relativeHeight="487587840" behindDoc="1" locked="0" layoutInCell="1" allowOverlap="1" wp14:anchorId="4A7C2EAC" wp14:editId="38E02516">
                 <wp:simplePos x="0" y="0"/>
                 <wp:positionH relativeFrom="page">
-                  <wp:posOffset>259079</wp:posOffset>
+                  <wp:posOffset>258445</wp:posOffset>
                 </wp:positionH>
                 <wp:positionV relativeFrom="paragraph">
-                  <wp:posOffset>245948</wp:posOffset>
+                  <wp:posOffset>447675</wp:posOffset>
                 </wp:positionV>
                 <wp:extent cx="6962140" cy="320675"/>
-                <wp:effectExtent l="0" t="0" r="0" b="0"/>
+                <wp:effectExtent l="0" t="0" r="0" b="3175"/>
                 <wp:wrapTopAndBottom/>
                 <wp:docPr id="5" name="Textbox 5"/>
                 <wp:cNvGraphicFramePr>
@@ -463,14 +452,13 @@
               </wp:anchor>
             </w:drawing>
           </mc:Choice>
-          <mc:Fallback xmlns:w16sdtfl="http://schemas.microsoft.com/office/word/2024/wordml/sdtformatlock" xmlns:w16du="http://schemas.microsoft.com/office/word/2023/wordml/word16du" xmlns:oel="http://schemas.microsoft.com/office/2019/extlst">
+          <mc:Fallback>
             <w:pict>
-              <v:shapetype id="_x0000_t202" coordsize="21600,21600" o:spt="202" path="m,l,21600r21600,l21600,xe">
+              <v:shapetype w14:anchorId="4A7C2EAC" id="_x0000_t202" coordsize="21600,21600" o:spt="202" path="m,l,21600r21600,l21600,xe">
                 <v:stroke joinstyle="miter"/>
                 <v:path gradientshapeok="t" o:connecttype="rect"/>
               </v:shapetype>
-              <v:shape id="Textbox 5" o:spid="_x0000_s1026" type="#_x0000_t202" style="position:absolute;margin-left:20.4pt;margin-top:19.35pt;width:548.2pt;height:25.25pt;z-index:-15728640;visibility:visible;mso-wrap-style:square;mso-wrap-distance-left:0;mso-wrap-distance-top:0;mso-wrap-distance-right:0;mso-wrap-distance-bottom:0;mso-position-horizontal:absolute;mso-position-horizontal-relative:page;mso-position-vertical:absolute;mso-position-vertical-relative:text;v-text-anchor:top" o:gfxdata="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" fillcolor="#dbe4f0" stroked="f">
-                <v:path arrowok="t"/>
+              <v:shape id="Textbox 5" o:spid="_x0000_s1026" type="#_x0000_t202" style="position:absolute;margin-left:20.35pt;margin-top:35.25pt;width:548.2pt;height:25.25pt;z-index:-15728640;visibility:visible;mso-wrap-style:square;mso-wrap-distance-left:0;mso-wrap-distance-top:0;mso-wrap-distance-right:0;mso-wrap-distance-bottom:0;mso-position-horizontal:absolute;mso-position-horizontal-relative:page;mso-position-vertical:absolute;mso-position-vertical-relative:text;v-text-anchor:top" o:gfxdata="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" fillcolor="#dbe4f0" stroked="f">
                 <v:textbox inset="0,0,0,0">
                   <w:txbxContent>
                     <w:p>
@@ -673,6 +661,7 @@
     <w:p>
       <w:pPr>
         <w:pStyle w:val="Corpodetexto"/>
+        <w:spacing w:before="133"/>
         <w:rPr>
           <w:rFonts w:ascii="Times New Roman"/>
           <w:b w:val="0"/>
@@ -2735,16 +2724,6 @@
         </w:tc>
       </w:tr>
     </w:tbl>
-    <w:p>
-      <w:pPr>
-        <w:pStyle w:val="Corpodetexto"/>
-        <w:rPr>
-          <w:rFonts w:ascii="Times New Roman"/>
-          <w:b w:val="0"/>
-          <w:sz w:val="20"/>
-        </w:rPr>
-      </w:pPr>
-    </w:p>
     <w:p>
       <w:pPr>
         <w:pStyle w:val="Corpodetexto"/>
@@ -2845,7 +2824,7 @@
               </wp:anchor>
             </w:drawing>
           </mc:Choice>
-          <mc:Fallback xmlns:w16sdtfl="http://schemas.microsoft.com/office/word/2024/wordml/sdtformatlock" xmlns:w16du="http://schemas.microsoft.com/office/word/2023/wordml/word16du" xmlns:oel="http://schemas.microsoft.com/office/2019/extlst">
+          <mc:Fallback xmlns:oel="http://schemas.microsoft.com/office/2019/extlst" xmlns:w16du="http://schemas.microsoft.com/office/word/2023/wordml/word16du" xmlns:w16sdtfl="http://schemas.microsoft.com/office/word/2024/wordml/sdtformatlock">
             <w:pict>
               <v:shape w14:anchorId="56F419D0" id="Graphic 6" o:spid="_x0000_s1026" style="position:absolute;margin-left:35.75pt;margin-top:20.7pt;width:236.85pt;height:1.45pt;z-index:-15728128;visibility:visible;mso-wrap-style:square;mso-wrap-distance-left:0;mso-wrap-distance-top:0;mso-wrap-distance-right:0;mso-wrap-distance-bottom:0;mso-position-horizontal:absolute;mso-position-horizontal-relative:page;mso-position-vertical:absolute;mso-position-vertical-relative:text;v-text-anchor:top" coordsize="3007995,18415" o:gfxdata="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" path="m3007487,l,,,18287r3007487,l3007487,xe" fillcolor="black" stroked="f">
                 <v:path arrowok="t"/>
@@ -2935,7 +2914,7 @@
               </wp:anchor>
             </w:drawing>
           </mc:Choice>
-          <mc:Fallback xmlns:w16sdtfl="http://schemas.microsoft.com/office/word/2024/wordml/sdtformatlock" xmlns:w16du="http://schemas.microsoft.com/office/word/2023/wordml/word16du" xmlns:oel="http://schemas.microsoft.com/office/2019/extlst">
+          <mc:Fallback xmlns:oel="http://schemas.microsoft.com/office/2019/extlst" xmlns:w16du="http://schemas.microsoft.com/office/word/2023/wordml/word16du" xmlns:w16sdtfl="http://schemas.microsoft.com/office/word/2024/wordml/sdtformatlock">
             <w:pict>
               <v:shape w14:anchorId="02307D5E" id="Graphic 7" o:spid="_x0000_s1026" style="position:absolute;margin-left:309.55pt;margin-top:21.45pt;width:249.55pt;height:1.45pt;z-index:-15727616;visibility:visible;mso-wrap-style:square;mso-wrap-distance-left:0;mso-wrap-distance-top:0;mso-wrap-distance-right:0;mso-wrap-distance-bottom:0;mso-position-horizontal:absolute;mso-position-horizontal-relative:page;mso-position-vertical:absolute;mso-position-vertical-relative:text;v-text-anchor:top" coordsize="3169285,18415" o:gfxdata="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" path="m3169030,l,,,18287r3169030,l3169030,xe" fillcolor="black" stroked="f">
                 <v:path arrowok="t"/>
@@ -3014,6 +2993,7 @@
         <w:spacing w:before="83"/>
         <w:rPr>
           <w:sz w:val="20"/>
+          <w:u w:val="single"/>
         </w:rPr>
       </w:pPr>
     </w:p>
@@ -3106,7 +3086,7 @@
               </wp:anchor>
             </w:drawing>
           </mc:Choice>
-          <mc:Fallback xmlns:w16sdtfl="http://schemas.microsoft.com/office/word/2024/wordml/sdtformatlock" xmlns:w16du="http://schemas.microsoft.com/office/word/2023/wordml/word16du" xmlns:oel="http://schemas.microsoft.com/office/2019/extlst">
+          <mc:Fallback xmlns:oel="http://schemas.microsoft.com/office/2019/extlst" xmlns:w16du="http://schemas.microsoft.com/office/word/2023/wordml/word16du" xmlns:w16sdtfl="http://schemas.microsoft.com/office/word/2024/wordml/sdtformatlock">
             <w:pict>
               <v:shape w14:anchorId="75B15D67" id="Graphic 8" o:spid="_x0000_s1026" style="position:absolute;margin-left:177.5pt;margin-top:12.55pt;width:373.3pt;height:1.45pt;z-index:-15727104;visibility:visible;mso-wrap-style:square;mso-wrap-distance-left:0;mso-wrap-distance-top:0;mso-wrap-distance-right:0;mso-wrap-distance-bottom:0;mso-position-horizontal:absolute;mso-position-horizontal-relative:page;mso-position-vertical:absolute;mso-position-vertical-relative:text;v-text-anchor:top" coordsize="4740910,18415" o:gfxdata="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" path="m4740529,l,,,18287r4740529,l4740529,xe" fillcolor="black" stroked="f">
                 <v:path arrowok="t"/>
@@ -3199,7 +3179,7 @@
               </wp:anchor>
             </w:drawing>
           </mc:Choice>
-          <mc:Fallback xmlns:w16sdtfl="http://schemas.microsoft.com/office/word/2024/wordml/sdtformatlock" xmlns:w16du="http://schemas.microsoft.com/office/word/2023/wordml/word16du" xmlns:oel="http://schemas.microsoft.com/office/2019/extlst">
+          <mc:Fallback xmlns:oel="http://schemas.microsoft.com/office/2019/extlst" xmlns:w16du="http://schemas.microsoft.com/office/word/2023/wordml/word16du" xmlns:w16sdtfl="http://schemas.microsoft.com/office/word/2024/wordml/sdtformatlock">
             <w:pict>
               <v:shape w14:anchorId="25EA92C4" id="Graphic 9" o:spid="_x0000_s1026" style="position:absolute;margin-left:57.75pt;margin-top:-5.45pt;width:96pt;height:110.25pt;z-index:15731712;visibility:visible;mso-wrap-style:square;mso-wrap-distance-left:0;mso-wrap-distance-top:0;mso-wrap-distance-right:0;mso-wrap-distance-bottom:0;mso-position-horizontal:absolute;mso-position-horizontal-relative:page;mso-position-vertical:absolute;mso-position-vertical-relative:text;v-text-anchor:top" coordsize="1219200,1400175" o:gfxdata="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" path="m,1400175r1219200,l1219200,,,,,1400175xe" filled="f">
                 <v:path arrowok="t"/>
@@ -3368,7 +3348,7 @@
               </wp:anchor>
             </w:drawing>
           </mc:Choice>
-          <mc:Fallback xmlns:w16sdtfl="http://schemas.microsoft.com/office/word/2024/wordml/sdtformatlock" xmlns:w16du="http://schemas.microsoft.com/office/word/2023/wordml/word16du" xmlns:oel="http://schemas.microsoft.com/office/2019/extlst">
+          <mc:Fallback xmlns:oel="http://schemas.microsoft.com/office/2019/extlst" xmlns:w16du="http://schemas.microsoft.com/office/word/2023/wordml/word16du" xmlns:w16sdtfl="http://schemas.microsoft.com/office/word/2024/wordml/sdtformatlock">
             <w:pict>
               <v:shape w14:anchorId="03D5B984" id="Graphic 10" o:spid="_x0000_s1026" style="position:absolute;margin-left:205.95pt;margin-top:18.1pt;width:301.25pt;height:1.45pt;z-index:-15726592;visibility:visible;mso-wrap-style:square;mso-wrap-distance-left:0;mso-wrap-distance-top:0;mso-wrap-distance-right:0;mso-wrap-distance-bottom:0;mso-position-horizontal:absolute;mso-position-horizontal-relative:page;mso-position-vertical:absolute;mso-position-vertical-relative:text;v-text-anchor:top" coordsize="3825875,18415" o:gfxdata="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" path="m3825875,l,,,18287r3825875,l3825875,xe" fillcolor="black" stroked="f">
                 <v:path arrowok="t"/>
@@ -3588,7 +3568,7 @@
               </wp:anchor>
             </w:drawing>
           </mc:Choice>
-          <mc:Fallback xmlns:w16sdtfl="http://schemas.microsoft.com/office/word/2024/wordml/sdtformatlock" xmlns:w16du="http://schemas.microsoft.com/office/word/2023/wordml/word16du" xmlns:oel="http://schemas.microsoft.com/office/2019/extlst">
+          <mc:Fallback xmlns:oel="http://schemas.microsoft.com/office/2019/extlst" xmlns:w16du="http://schemas.microsoft.com/office/word/2023/wordml/word16du" xmlns:w16sdtfl="http://schemas.microsoft.com/office/word/2024/wordml/sdtformatlock">
             <w:pict>
               <v:shape w14:anchorId="1BE2CA1D" id="Graphic 11" o:spid="_x0000_s1026" style="position:absolute;margin-left:92.2pt;margin-top:19pt;width:409.85pt;height:.1pt;z-index:-15726080;visibility:visible;mso-wrap-style:square;mso-wrap-distance-left:0;mso-wrap-distance-top:0;mso-wrap-distance-right:0;mso-wrap-distance-bottom:0;mso-position-horizontal:absolute;mso-position-horizontal-relative:page;mso-position-vertical:absolute;mso-position-vertical-relative:text;v-text-anchor:top" coordsize="5205095,1270" o:gfxdata="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" path="m,l5205095,e" filled="f">
                 <v:path arrowok="t"/>

</xml_diff>